<commit_message>
Incorporate field corrections into pilot plan status
Reflects the actual on-the-ground status supplied by the customer team:
- DB/GPU server (checklist item 1) status unknown, not confirmed
- Platform server delivered under spec (32GB RAM/100GB SSD vs 64/200
  required), disk expanded during install
- Container env self-deployed (Docker set up in-house)
- КХД/ESB access status unknown/not received
- Cloud LLM API keys received 04.08 but not yet wired into AI Guard
- Этап 1 "infrastructure allocated" row downgraded to partial pending
  DB/GPU server confirmation
</commit_message>
<xml_diff>
--- a/docs/analysis/case-03-pilot-execution-plan.docx
+++ b/docs/analysis/case-03-pilot-execution-plan.docx
@@ -340,16 +340,22 @@
               <w:bottom w:val="single" w:color="CBD5E1" w:sz="4"/>
               <w:right w:val="single" w:color="CBD5E1" w:sz="4"/>
             </w:tcBorders>
-            <w:tcMar>
-              <w:top w:type="dxa" w:w="80"/>
-              <w:left w:type="dxa" w:w="100"/>
-              <w:bottom w:type="dxa" w:w="80"/>
-              <w:right w:type="dxa" w:w="100"/>
-            </w:tcMar>
-          </w:tcPr>
-          <w:p>
-            <w:r>
-              <w:t xml:space="preserve">Этап 1</w:t>
+            <w:shd w:fill="FDF0E1" w:val="clear"/>
+            <w:tcMar>
+              <w:top w:type="dxa" w:w="80"/>
+              <w:left w:type="dxa" w:w="100"/>
+              <w:bottom w:type="dxa" w:w="80"/>
+              <w:right w:type="dxa" w:w="100"/>
+            </w:tcMar>
+          </w:tcPr>
+          <w:p>
+            <w:r>
+              <w:rPr>
+                <w:b/>
+                <w:bCs/>
+                <w:color w:val="B45309"/>
+              </w:rPr>
+              <w:t xml:space="preserve">⏳ Этап 1 — статус не известен</w:t>
             </w:r>
           </w:p>
         </w:tc>
@@ -445,7 +451,7 @@
                 <w:bCs/>
                 <w:color w:val="1E7B34"/>
               </w:rPr>
-              <w:t xml:space="preserve">✅ Выполнено</w:t>
+              <w:t xml:space="preserve">✅ Выполнено (по факту выделено 32 ГБ RAM, 100 ГБ SSD вместо заявленных 64/200 — дисковое пространство докраивали по ходу установки)</w:t>
             </w:r>
           </w:p>
         </w:tc>
@@ -541,7 +547,7 @@
                 <w:bCs/>
                 <w:color w:val="1E7B34"/>
               </w:rPr>
-              <w:t xml:space="preserve">✅ Выполнено</w:t>
+              <w:t xml:space="preserve">✅ Выполнено (Docker развернули собственными силами)</w:t>
             </w:r>
           </w:p>
         </w:tc>
@@ -637,7 +643,7 @@
                 <w:bCs/>
                 <w:color w:val="B45309"/>
               </w:rPr>
-              <w:t xml:space="preserve">⏳ Не получено — просрочено (цель была 31.07.2026), блокирует старт часов пилота</w:t>
+              <w:t xml:space="preserve">⏳ Статус не известен (не получено) — цель была 31.07.2026, блокирует старт часов пилота</w:t>
             </w:r>
           </w:p>
         </w:tc>
@@ -733,7 +739,7 @@
                 <w:bCs/>
                 <w:color w:val="B45309"/>
               </w:rPr>
-              <w:t xml:space="preserve">⏳ Не получено — просрочено (цель была 31.07.2026), блокирует старт часов пилота</w:t>
+              <w:t xml:space="preserve">⏳ Статус не известен (нет доступа) — цель была 31.07.2026, блокирует старт часов пилота</w:t>
             </w:r>
           </w:p>
         </w:tc>
@@ -1273,7 +1279,7 @@
           </w:tcPr>
           <w:p>
             <w:r>
-              <w:t xml:space="preserve">Этап 2</w:t>
+              <w:t xml:space="preserve">Этап 2 (ключи получены 04.08.2026, подключение к AI Guard ещё не выполнено)</w:t>
             </w:r>
           </w:p>
         </w:tc>
@@ -1585,7 +1591,7 @@
                 <w:bCs/>
                 <w:color w:val="B45309"/>
               </w:rPr>
-              <w:t xml:space="preserve">⏳ Не получено — просрочено</w:t>
+              <w:t xml:space="preserve">⏳ Не получено</w:t>
             </w:r>
           </w:p>
         </w:tc>
@@ -1659,7 +1665,7 @@
                 <w:bCs/>
                 <w:color w:val="B45309"/>
               </w:rPr>
-              <w:t xml:space="preserve">⏳ Не получено — просрочено</w:t>
+              <w:t xml:space="preserve">⏳ Нет доступа</w:t>
             </w:r>
           </w:p>
         </w:tc>
@@ -1706,6 +1712,228 @@
           <w:p>
             <w:r>
               <w:t xml:space="preserve">Д8</w:t>
+            </w:r>
+          </w:p>
+        </w:tc>
+        <w:tc>
+          <w:tcPr>
+            <w:tcW w:type="dxa" w:w="3000"/>
+            <w:tcBorders>
+              <w:top w:val="single" w:color="CBD5E1" w:sz="4"/>
+              <w:left w:val="single" w:color="CBD5E1" w:sz="4"/>
+              <w:bottom w:val="single" w:color="CBD5E1" w:sz="4"/>
+              <w:right w:val="single" w:color="CBD5E1" w:sz="4"/>
+            </w:tcBorders>
+            <w:shd w:fill="FDF0E1" w:val="clear"/>
+            <w:tcMar>
+              <w:top w:type="dxa" w:w="80"/>
+              <w:left w:type="dxa" w:w="100"/>
+              <w:bottom w:type="dxa" w:w="80"/>
+              <w:right w:type="dxa" w:w="100"/>
+            </w:tcMar>
+          </w:tcPr>
+          <w:p>
+            <w:r>
+              <w:rPr>
+                <w:b/>
+                <w:bCs/>
+                <w:color w:val="B45309"/>
+              </w:rPr>
+              <w:t xml:space="preserve">⏳ Частично — сервер/ВМ под СУБД и GPU (п.1 чек-листа) не подтверждён</w:t>
+            </w:r>
+          </w:p>
+        </w:tc>
+      </w:tr>
+      <w:tr>
+        <w:tc>
+          <w:tcPr>
+            <w:tcW w:type="dxa" w:w="5200"/>
+            <w:tcBorders>
+              <w:top w:val="single" w:color="CBD5E1" w:sz="4"/>
+              <w:left w:val="single" w:color="CBD5E1" w:sz="4"/>
+              <w:bottom w:val="single" w:color="CBD5E1" w:sz="4"/>
+              <w:right w:val="single" w:color="CBD5E1" w:sz="4"/>
+            </w:tcBorders>
+            <w:tcMar>
+              <w:top w:type="dxa" w:w="80"/>
+              <w:left w:type="dxa" w:w="100"/>
+              <w:bottom w:type="dxa" w:w="80"/>
+              <w:right w:type="dxa" w:w="100"/>
+            </w:tcMar>
+          </w:tcPr>
+          <w:p>
+            <w:r>
+              <w:t xml:space="preserve">Согласование состава и прав 2–5 ролей (верхнеуровнево, без детальной настройки)</w:t>
+            </w:r>
+          </w:p>
+        </w:tc>
+        <w:tc>
+          <w:tcPr>
+            <w:tcW w:type="dxa" w:w="3500"/>
+            <w:tcBorders>
+              <w:top w:val="single" w:color="CBD5E1" w:sz="4"/>
+              <w:left w:val="single" w:color="CBD5E1" w:sz="4"/>
+              <w:bottom w:val="single" w:color="CBD5E1" w:sz="4"/>
+              <w:right w:val="single" w:color="CBD5E1" w:sz="4"/>
+            </w:tcBorders>
+            <w:tcMar>
+              <w:top w:type="dxa" w:w="80"/>
+              <w:left w:type="dxa" w:w="100"/>
+              <w:bottom w:type="dxa" w:w="80"/>
+              <w:right w:type="dxa" w:w="100"/>
+            </w:tcMar>
+          </w:tcPr>
+          <w:p>
+            <w:r>
+              <w:t xml:space="preserve">Совместно</w:t>
+            </w:r>
+          </w:p>
+        </w:tc>
+        <w:tc>
+          <w:tcPr>
+            <w:tcW w:type="dxa" w:w="3000"/>
+            <w:tcBorders>
+              <w:top w:val="single" w:color="CBD5E1" w:sz="4"/>
+              <w:left w:val="single" w:color="CBD5E1" w:sz="4"/>
+              <w:bottom w:val="single" w:color="CBD5E1" w:sz="4"/>
+              <w:right w:val="single" w:color="CBD5E1" w:sz="4"/>
+            </w:tcBorders>
+            <w:shd w:fill="E6F4EA" w:val="clear"/>
+            <w:tcMar>
+              <w:top w:type="dxa" w:w="80"/>
+              <w:left w:type="dxa" w:w="100"/>
+              <w:bottom w:type="dxa" w:w="80"/>
+              <w:right w:type="dxa" w:w="100"/>
+            </w:tcMar>
+          </w:tcPr>
+          <w:p>
+            <w:r>
+              <w:rPr>
+                <w:b/>
+                <w:bCs/>
+                <w:color w:val="1E7B34"/>
+              </w:rPr>
+              <w:t xml:space="preserve">✅ (закрыто до Дня 1 по чек-листу)</w:t>
+            </w:r>
+          </w:p>
+        </w:tc>
+      </w:tr>
+      <w:tr>
+        <w:tc>
+          <w:tcPr>
+            <w:tcW w:type="dxa" w:w="5200"/>
+            <w:tcBorders>
+              <w:top w:val="single" w:color="CBD5E1" w:sz="4"/>
+              <w:left w:val="single" w:color="CBD5E1" w:sz="4"/>
+              <w:bottom w:val="single" w:color="CBD5E1" w:sz="4"/>
+              <w:right w:val="single" w:color="CBD5E1" w:sz="4"/>
+            </w:tcBorders>
+            <w:tcMar>
+              <w:top w:type="dxa" w:w="80"/>
+              <w:left w:type="dxa" w:w="100"/>
+              <w:bottom w:type="dxa" w:w="80"/>
+              <w:right w:type="dxa" w:w="100"/>
+            </w:tcMar>
+          </w:tcPr>
+          <w:p>
+            <w:r>
+              <w:t xml:space="preserve">Согласование состава 2 RAG-коллекций (какие документы, не сама загрузка)</w:t>
+            </w:r>
+          </w:p>
+        </w:tc>
+        <w:tc>
+          <w:tcPr>
+            <w:tcW w:type="dxa" w:w="3500"/>
+            <w:tcBorders>
+              <w:top w:val="single" w:color="CBD5E1" w:sz="4"/>
+              <w:left w:val="single" w:color="CBD5E1" w:sz="4"/>
+              <w:bottom w:val="single" w:color="CBD5E1" w:sz="4"/>
+              <w:right w:val="single" w:color="CBD5E1" w:sz="4"/>
+            </w:tcBorders>
+            <w:tcMar>
+              <w:top w:type="dxa" w:w="80"/>
+              <w:left w:type="dxa" w:w="100"/>
+              <w:bottom w:type="dxa" w:w="80"/>
+              <w:right w:type="dxa" w:w="100"/>
+            </w:tcMar>
+          </w:tcPr>
+          <w:p>
+            <w:r>
+              <w:t xml:space="preserve">Совместно</w:t>
+            </w:r>
+          </w:p>
+        </w:tc>
+        <w:tc>
+          <w:tcPr>
+            <w:tcW w:type="dxa" w:w="3000"/>
+            <w:tcBorders>
+              <w:top w:val="single" w:color="CBD5E1" w:sz="4"/>
+              <w:left w:val="single" w:color="CBD5E1" w:sz="4"/>
+              <w:bottom w:val="single" w:color="CBD5E1" w:sz="4"/>
+              <w:right w:val="single" w:color="CBD5E1" w:sz="4"/>
+            </w:tcBorders>
+            <w:shd w:fill="E6F4EA" w:val="clear"/>
+            <w:tcMar>
+              <w:top w:type="dxa" w:w="80"/>
+              <w:left w:type="dxa" w:w="100"/>
+              <w:bottom w:type="dxa" w:w="80"/>
+              <w:right w:type="dxa" w:w="100"/>
+            </w:tcMar>
+          </w:tcPr>
+          <w:p>
+            <w:r>
+              <w:rPr>
+                <w:b/>
+                <w:bCs/>
+                <w:color w:val="1E7B34"/>
+              </w:rPr>
+              <w:t xml:space="preserve">✅ (закрыто до Дня 1 по чек-листу)</w:t>
+            </w:r>
+          </w:p>
+        </w:tc>
+      </w:tr>
+      <w:tr>
+        <w:tc>
+          <w:tcPr>
+            <w:tcW w:type="dxa" w:w="5200"/>
+            <w:tcBorders>
+              <w:top w:val="single" w:color="CBD5E1" w:sz="4"/>
+              <w:left w:val="single" w:color="CBD5E1" w:sz="4"/>
+              <w:bottom w:val="single" w:color="CBD5E1" w:sz="4"/>
+              <w:right w:val="single" w:color="CBD5E1" w:sz="4"/>
+            </w:tcBorders>
+            <w:tcMar>
+              <w:top w:type="dxa" w:w="80"/>
+              <w:left w:type="dxa" w:w="100"/>
+              <w:bottom w:type="dxa" w:w="80"/>
+              <w:right w:type="dxa" w:w="100"/>
+            </w:tcMar>
+          </w:tcPr>
+          <w:p>
+            <w:r>
+              <w:t xml:space="preserve">Установка и базовая настройка платформы на стенде</w:t>
+            </w:r>
+          </w:p>
+        </w:tc>
+        <w:tc>
+          <w:tcPr>
+            <w:tcW w:type="dxa" w:w="3500"/>
+            <w:tcBorders>
+              <w:top w:val="single" w:color="CBD5E1" w:sz="4"/>
+              <w:left w:val="single" w:color="CBD5E1" w:sz="4"/>
+              <w:bottom w:val="single" w:color="CBD5E1" w:sz="4"/>
+              <w:right w:val="single" w:color="CBD5E1" w:sz="4"/>
+            </w:tcBorders>
+            <w:tcMar>
+              <w:top w:type="dxa" w:w="80"/>
+              <w:left w:type="dxa" w:w="100"/>
+              <w:bottom w:type="dxa" w:w="80"/>
+              <w:right w:type="dxa" w:w="100"/>
+            </w:tcMar>
+          </w:tcPr>
+          <w:p>
+            <w:r>
+              <w:t xml:space="preserve">АйТиКью Про — команда внедрения</w:t>
             </w:r>
           </w:p>
         </w:tc>
@@ -1757,228 +1985,6 @@
           </w:tcPr>
           <w:p>
             <w:r>
-              <w:t xml:space="preserve">Согласование состава и прав 2–5 ролей (верхнеуровнево, без детальной настройки)</w:t>
-            </w:r>
-          </w:p>
-        </w:tc>
-        <w:tc>
-          <w:tcPr>
-            <w:tcW w:type="dxa" w:w="3500"/>
-            <w:tcBorders>
-              <w:top w:val="single" w:color="CBD5E1" w:sz="4"/>
-              <w:left w:val="single" w:color="CBD5E1" w:sz="4"/>
-              <w:bottom w:val="single" w:color="CBD5E1" w:sz="4"/>
-              <w:right w:val="single" w:color="CBD5E1" w:sz="4"/>
-            </w:tcBorders>
-            <w:tcMar>
-              <w:top w:type="dxa" w:w="80"/>
-              <w:left w:type="dxa" w:w="100"/>
-              <w:bottom w:type="dxa" w:w="80"/>
-              <w:right w:type="dxa" w:w="100"/>
-            </w:tcMar>
-          </w:tcPr>
-          <w:p>
-            <w:r>
-              <w:t xml:space="preserve">Совместно</w:t>
-            </w:r>
-          </w:p>
-        </w:tc>
-        <w:tc>
-          <w:tcPr>
-            <w:tcW w:type="dxa" w:w="3000"/>
-            <w:tcBorders>
-              <w:top w:val="single" w:color="CBD5E1" w:sz="4"/>
-              <w:left w:val="single" w:color="CBD5E1" w:sz="4"/>
-              <w:bottom w:val="single" w:color="CBD5E1" w:sz="4"/>
-              <w:right w:val="single" w:color="CBD5E1" w:sz="4"/>
-            </w:tcBorders>
-            <w:shd w:fill="E6F4EA" w:val="clear"/>
-            <w:tcMar>
-              <w:top w:type="dxa" w:w="80"/>
-              <w:left w:type="dxa" w:w="100"/>
-              <w:bottom w:type="dxa" w:w="80"/>
-              <w:right w:type="dxa" w:w="100"/>
-            </w:tcMar>
-          </w:tcPr>
-          <w:p>
-            <w:r>
-              <w:rPr>
-                <w:b/>
-                <w:bCs/>
-                <w:color w:val="1E7B34"/>
-              </w:rPr>
-              <w:t xml:space="preserve">✅ (закрыто до Дня 1 по чек-листу)</w:t>
-            </w:r>
-          </w:p>
-        </w:tc>
-      </w:tr>
-      <w:tr>
-        <w:tc>
-          <w:tcPr>
-            <w:tcW w:type="dxa" w:w="5200"/>
-            <w:tcBorders>
-              <w:top w:val="single" w:color="CBD5E1" w:sz="4"/>
-              <w:left w:val="single" w:color="CBD5E1" w:sz="4"/>
-              <w:bottom w:val="single" w:color="CBD5E1" w:sz="4"/>
-              <w:right w:val="single" w:color="CBD5E1" w:sz="4"/>
-            </w:tcBorders>
-            <w:tcMar>
-              <w:top w:type="dxa" w:w="80"/>
-              <w:left w:type="dxa" w:w="100"/>
-              <w:bottom w:type="dxa" w:w="80"/>
-              <w:right w:type="dxa" w:w="100"/>
-            </w:tcMar>
-          </w:tcPr>
-          <w:p>
-            <w:r>
-              <w:t xml:space="preserve">Согласование состава 2 RAG-коллекций (какие документы, не сама загрузка)</w:t>
-            </w:r>
-          </w:p>
-        </w:tc>
-        <w:tc>
-          <w:tcPr>
-            <w:tcW w:type="dxa" w:w="3500"/>
-            <w:tcBorders>
-              <w:top w:val="single" w:color="CBD5E1" w:sz="4"/>
-              <w:left w:val="single" w:color="CBD5E1" w:sz="4"/>
-              <w:bottom w:val="single" w:color="CBD5E1" w:sz="4"/>
-              <w:right w:val="single" w:color="CBD5E1" w:sz="4"/>
-            </w:tcBorders>
-            <w:tcMar>
-              <w:top w:type="dxa" w:w="80"/>
-              <w:left w:type="dxa" w:w="100"/>
-              <w:bottom w:type="dxa" w:w="80"/>
-              <w:right w:type="dxa" w:w="100"/>
-            </w:tcMar>
-          </w:tcPr>
-          <w:p>
-            <w:r>
-              <w:t xml:space="preserve">Совместно</w:t>
-            </w:r>
-          </w:p>
-        </w:tc>
-        <w:tc>
-          <w:tcPr>
-            <w:tcW w:type="dxa" w:w="3000"/>
-            <w:tcBorders>
-              <w:top w:val="single" w:color="CBD5E1" w:sz="4"/>
-              <w:left w:val="single" w:color="CBD5E1" w:sz="4"/>
-              <w:bottom w:val="single" w:color="CBD5E1" w:sz="4"/>
-              <w:right w:val="single" w:color="CBD5E1" w:sz="4"/>
-            </w:tcBorders>
-            <w:shd w:fill="E6F4EA" w:val="clear"/>
-            <w:tcMar>
-              <w:top w:type="dxa" w:w="80"/>
-              <w:left w:type="dxa" w:w="100"/>
-              <w:bottom w:type="dxa" w:w="80"/>
-              <w:right w:type="dxa" w:w="100"/>
-            </w:tcMar>
-          </w:tcPr>
-          <w:p>
-            <w:r>
-              <w:rPr>
-                <w:b/>
-                <w:bCs/>
-                <w:color w:val="1E7B34"/>
-              </w:rPr>
-              <w:t xml:space="preserve">✅ (закрыто до Дня 1 по чек-листу)</w:t>
-            </w:r>
-          </w:p>
-        </w:tc>
-      </w:tr>
-      <w:tr>
-        <w:tc>
-          <w:tcPr>
-            <w:tcW w:type="dxa" w:w="5200"/>
-            <w:tcBorders>
-              <w:top w:val="single" w:color="CBD5E1" w:sz="4"/>
-              <w:left w:val="single" w:color="CBD5E1" w:sz="4"/>
-              <w:bottom w:val="single" w:color="CBD5E1" w:sz="4"/>
-              <w:right w:val="single" w:color="CBD5E1" w:sz="4"/>
-            </w:tcBorders>
-            <w:tcMar>
-              <w:top w:type="dxa" w:w="80"/>
-              <w:left w:type="dxa" w:w="100"/>
-              <w:bottom w:type="dxa" w:w="80"/>
-              <w:right w:type="dxa" w:w="100"/>
-            </w:tcMar>
-          </w:tcPr>
-          <w:p>
-            <w:r>
-              <w:t xml:space="preserve">Установка и базовая настройка платформы на стенде</w:t>
-            </w:r>
-          </w:p>
-        </w:tc>
-        <w:tc>
-          <w:tcPr>
-            <w:tcW w:type="dxa" w:w="3500"/>
-            <w:tcBorders>
-              <w:top w:val="single" w:color="CBD5E1" w:sz="4"/>
-              <w:left w:val="single" w:color="CBD5E1" w:sz="4"/>
-              <w:bottom w:val="single" w:color="CBD5E1" w:sz="4"/>
-              <w:right w:val="single" w:color="CBD5E1" w:sz="4"/>
-            </w:tcBorders>
-            <w:tcMar>
-              <w:top w:type="dxa" w:w="80"/>
-              <w:left w:type="dxa" w:w="100"/>
-              <w:bottom w:type="dxa" w:w="80"/>
-              <w:right w:type="dxa" w:w="100"/>
-            </w:tcMar>
-          </w:tcPr>
-          <w:p>
-            <w:r>
-              <w:t xml:space="preserve">АйТиКью Про — команда внедрения</w:t>
-            </w:r>
-          </w:p>
-        </w:tc>
-        <w:tc>
-          <w:tcPr>
-            <w:tcW w:type="dxa" w:w="3000"/>
-            <w:tcBorders>
-              <w:top w:val="single" w:color="CBD5E1" w:sz="4"/>
-              <w:left w:val="single" w:color="CBD5E1" w:sz="4"/>
-              <w:bottom w:val="single" w:color="CBD5E1" w:sz="4"/>
-              <w:right w:val="single" w:color="CBD5E1" w:sz="4"/>
-            </w:tcBorders>
-            <w:shd w:fill="E6F4EA" w:val="clear"/>
-            <w:tcMar>
-              <w:top w:type="dxa" w:w="80"/>
-              <w:left w:type="dxa" w:w="100"/>
-              <w:bottom w:type="dxa" w:w="80"/>
-              <w:right w:type="dxa" w:w="100"/>
-            </w:tcMar>
-          </w:tcPr>
-          <w:p>
-            <w:r>
-              <w:rPr>
-                <w:b/>
-                <w:bCs/>
-                <w:color w:val="1E7B34"/>
-              </w:rPr>
-              <w:t xml:space="preserve">✅</w:t>
-            </w:r>
-          </w:p>
-        </w:tc>
-      </w:tr>
-      <w:tr>
-        <w:tc>
-          <w:tcPr>
-            <w:tcW w:type="dxa" w:w="5200"/>
-            <w:tcBorders>
-              <w:top w:val="single" w:color="CBD5E1" w:sz="4"/>
-              <w:left w:val="single" w:color="CBD5E1" w:sz="4"/>
-              <w:bottom w:val="single" w:color="CBD5E1" w:sz="4"/>
-              <w:right w:val="single" w:color="CBD5E1" w:sz="4"/>
-            </w:tcBorders>
-            <w:tcMar>
-              <w:top w:type="dxa" w:w="80"/>
-              <w:left w:type="dxa" w:w="100"/>
-              <w:bottom w:type="dxa" w:w="80"/>
-              <w:right w:type="dxa" w:w="100"/>
-            </w:tcMar>
-          </w:tcPr>
-          <w:p>
-            <w:r>
               <w:t xml:space="preserve">Пробный запуск</w:t>
             </w:r>
           </w:p>
@@ -2047,7 +2053,7 @@
         <w:t xml:space="preserve">Результат этапа получен частично</w:t>
       </w:r>
       <w:r>
-        <w:t xml:space="preserve">: стенд развёрнут, инфраструктура выделена, состав ролей и RAG-коллекций согласован, пробный запуск проведён. Открытым остаётся доступ к КХД и ESB — без него Этап 1 не может считаться закрытым, и официальный отсчёт 6-недельного пилота не запущен.</w:t>
+        <w:t xml:space="preserve">: сервер под платформу и контейнерная среда развёрнуты (по факту 32 ГБ RAM / 100 ГБ SSD вместо заявленных 64/200, докраивали место по ходу установки; Docker разворачивали собственными силами), состав ролей и RAG-коллекций согласован, пробный запуск проведён. Открытым остаётся сервер/ВМ под СУБД и GPU (статус не известен) и доступ к КХД/ESB — без них Этап 1 не может считаться закрытым, и официальный отсчёт 6-недельного пилота не запущен.</w:t>
       </w:r>
     </w:p>
     <w:p>
@@ -7015,7 +7021,7 @@
         </w:numPr>
         <w:spacing w:after="120"/>
       </w:pPr>
-      <w:hyperlink w:history="1" r:id="rIdfbhta4i9mts9y0vlh8zcu">
+      <w:hyperlink w:history="1" r:id="rIdl4ceei89t4jsle-lxeg6a">
         <w:r>
           <w:rPr>
             <w:rStyle w:val="Hyperlink"/>
@@ -7037,7 +7043,7 @@
         </w:numPr>
         <w:spacing w:after="120"/>
       </w:pPr>
-      <w:hyperlink w:history="1" r:id="rIdrqkxeu613z5zcb-fxwu66">
+      <w:hyperlink w:history="1" r:id="rIdfgdbplg6wculyw70l4h-t">
         <w:r>
           <w:rPr>
             <w:rStyle w:val="Hyperlink"/>
@@ -7059,7 +7065,7 @@
         </w:numPr>
         <w:spacing w:after="120"/>
       </w:pPr>
-      <w:hyperlink w:history="1" r:id="rIdvmqns21touh7yphzsotnn">
+      <w:hyperlink w:history="1" r:id="rIdw53ly1yekkenx0k4zedpg">
         <w:r>
           <w:rPr>
             <w:rStyle w:val="Hyperlink"/>
@@ -7071,7 +7077,7 @@
       <w:r>
         <w:t xml:space="preserve">, </w:t>
       </w:r>
-      <w:hyperlink w:history="1" r:id="rIddcysht40083rsinux_xbe">
+      <w:hyperlink w:history="1" r:id="rId9etm3_cxtpm-kok19ms8d">
         <w:r>
           <w:rPr>
             <w:rStyle w:val="Hyperlink"/>

</xml_diff>

<commit_message>
Merge DB/platform server checklist items, mark infra + RAG loading done
Server for DB/GPU and server for platform turned out to be the same
physical machine, not two separate ones as the ТЗ assumed - merged into
one checklist item and marked done along with containers. RAG collection
loading has started ahead of schedule and search already works, so that
item and Track F (Этап 2) are updated to reflect it. КХД/ESB access
remains the only open item blocking Этап 1.
</commit_message>
<xml_diff>
--- a/docs/analysis/case-03-pilot-execution-plan.docx
+++ b/docs/analysis/case-03-pilot-execution-plan.docx
@@ -305,103 +305,7 @@
           </w:tcPr>
           <w:p>
             <w:r>
-              <w:t xml:space="preserve">Выделенный сервер/ВМ под СУБД (≈8 vCPU, 64 ГБ RAM, 200+ ГБ SSD) + 1×GPU (32–40 ГБ+) для эмбеддеров</w:t>
-            </w:r>
-          </w:p>
-        </w:tc>
-        <w:tc>
-          <w:tcPr>
-            <w:tcW w:type="dxa" w:w="1800"/>
-            <w:tcBorders>
-              <w:top w:val="single" w:color="CBD5E1" w:sz="4"/>
-              <w:left w:val="single" w:color="CBD5E1" w:sz="4"/>
-              <w:bottom w:val="single" w:color="CBD5E1" w:sz="4"/>
-              <w:right w:val="single" w:color="CBD5E1" w:sz="4"/>
-            </w:tcBorders>
-            <w:tcMar>
-              <w:top w:type="dxa" w:w="80"/>
-              <w:left w:type="dxa" w:w="100"/>
-              <w:bottom w:type="dxa" w:w="80"/>
-              <w:right w:type="dxa" w:w="100"/>
-            </w:tcMar>
-          </w:tcPr>
-          <w:p>
-            <w:r>
-              <w:t xml:space="preserve">Д8</w:t>
-            </w:r>
-          </w:p>
-        </w:tc>
-        <w:tc>
-          <w:tcPr>
-            <w:tcW w:type="dxa" w:w="3300"/>
-            <w:tcBorders>
-              <w:top w:val="single" w:color="CBD5E1" w:sz="4"/>
-              <w:left w:val="single" w:color="CBD5E1" w:sz="4"/>
-              <w:bottom w:val="single" w:color="CBD5E1" w:sz="4"/>
-              <w:right w:val="single" w:color="CBD5E1" w:sz="4"/>
-            </w:tcBorders>
-            <w:shd w:fill="FDF0E1" w:val="clear"/>
-            <w:tcMar>
-              <w:top w:type="dxa" w:w="80"/>
-              <w:left w:type="dxa" w:w="100"/>
-              <w:bottom w:type="dxa" w:w="80"/>
-              <w:right w:type="dxa" w:w="100"/>
-            </w:tcMar>
-          </w:tcPr>
-          <w:p>
-            <w:r>
-              <w:rPr>
-                <w:b/>
-                <w:bCs/>
-                <w:color w:val="B45309"/>
-              </w:rPr>
-              <w:t xml:space="preserve">⏳ Этап 1 — статус не известен</w:t>
-            </w:r>
-          </w:p>
-        </w:tc>
-      </w:tr>
-      <w:tr>
-        <w:tc>
-          <w:tcPr>
-            <w:tcW w:type="dxa" w:w="700"/>
-            <w:tcBorders>
-              <w:top w:val="single" w:color="CBD5E1" w:sz="4"/>
-              <w:left w:val="single" w:color="CBD5E1" w:sz="4"/>
-              <w:bottom w:val="single" w:color="CBD5E1" w:sz="4"/>
-              <w:right w:val="single" w:color="CBD5E1" w:sz="4"/>
-            </w:tcBorders>
-            <w:tcMar>
-              <w:top w:type="dxa" w:w="80"/>
-              <w:left w:type="dxa" w:w="100"/>
-              <w:bottom w:type="dxa" w:w="80"/>
-              <w:right w:type="dxa" w:w="100"/>
-            </w:tcMar>
-          </w:tcPr>
-          <w:p>
-            <w:r>
-              <w:t xml:space="preserve">2</w:t>
-            </w:r>
-          </w:p>
-        </w:tc>
-        <w:tc>
-          <w:tcPr>
-            <w:tcW w:type="dxa" w:w="4900"/>
-            <w:tcBorders>
-              <w:top w:val="single" w:color="CBD5E1" w:sz="4"/>
-              <w:left w:val="single" w:color="CBD5E1" w:sz="4"/>
-              <w:bottom w:val="single" w:color="CBD5E1" w:sz="4"/>
-              <w:right w:val="single" w:color="CBD5E1" w:sz="4"/>
-            </w:tcBorders>
-            <w:tcMar>
-              <w:top w:type="dxa" w:w="80"/>
-              <w:left w:type="dxa" w:w="100"/>
-              <w:bottom w:type="dxa" w:w="80"/>
-              <w:right w:type="dxa" w:w="100"/>
-            </w:tcMar>
-          </w:tcPr>
-          <w:p>
-            <w:r>
-              <w:t xml:space="preserve">Выделенный сервер/ВМ под компоненты платформы (≈8 vCPU, 64 ГБ RAM, 200 ГБ SSD)</w:t>
+              <w:t xml:space="preserve">Сервер/ВМ под СУБД+платформу и под контейнерную среду (≈8 vCPU, 32 ГБ RAM, 100 ГБ SSD, GPU для эмбеддеров) — по факту один общий сервер, а не два раздельных, как изначально предполагалось по ТЗ</w:t>
             </w:r>
           </w:p>
         </w:tc>
@@ -451,7 +355,7 @@
                 <w:bCs/>
                 <w:color w:val="1E7B34"/>
               </w:rPr>
-              <w:t xml:space="preserve">✅ Выполнено (по факту выделено 32 ГБ RAM, 100 ГБ SSD вместо заявленных 64/200 — дисковое пространство докраивали по ходу установки)</w:t>
+              <w:t xml:space="preserve">✅ Выполнено — инфраструктура развёрнута и подтверждена</w:t>
             </w:r>
           </w:p>
         </w:tc>
@@ -475,7 +379,7 @@
           </w:tcPr>
           <w:p>
             <w:r>
-              <w:t xml:space="preserve">3</w:t>
+              <w:t xml:space="preserve">2</w:t>
             </w:r>
           </w:p>
         </w:tc>
@@ -571,7 +475,7 @@
           </w:tcPr>
           <w:p>
             <w:r>
-              <w:t xml:space="preserve">4</w:t>
+              <w:t xml:space="preserve">3</w:t>
             </w:r>
           </w:p>
         </w:tc>
@@ -667,7 +571,7 @@
           </w:tcPr>
           <w:p>
             <w:r>
-              <w:t xml:space="preserve">5</w:t>
+              <w:t xml:space="preserve">4</w:t>
             </w:r>
           </w:p>
         </w:tc>
@@ -763,6 +667,96 @@
           </w:tcPr>
           <w:p>
             <w:r>
+              <w:t xml:space="preserve">5</w:t>
+            </w:r>
+          </w:p>
+        </w:tc>
+        <w:tc>
+          <w:tcPr>
+            <w:tcW w:type="dxa" w:w="4900"/>
+            <w:tcBorders>
+              <w:top w:val="single" w:color="CBD5E1" w:sz="4"/>
+              <w:left w:val="single" w:color="CBD5E1" w:sz="4"/>
+              <w:bottom w:val="single" w:color="CBD5E1" w:sz="4"/>
+              <w:right w:val="single" w:color="CBD5E1" w:sz="4"/>
+            </w:tcBorders>
+            <w:tcMar>
+              <w:top w:type="dxa" w:w="80"/>
+              <w:left w:type="dxa" w:w="100"/>
+              <w:bottom w:type="dxa" w:w="80"/>
+              <w:right w:type="dxa" w:w="100"/>
+            </w:tcMar>
+          </w:tcPr>
+          <w:p>
+            <w:r>
+              <w:t xml:space="preserve">Сетевой доступ к MCP-серверу + спецификация интерфейса + учётные данные</w:t>
+            </w:r>
+          </w:p>
+        </w:tc>
+        <w:tc>
+          <w:tcPr>
+            <w:tcW w:type="dxa" w:w="1800"/>
+            <w:tcBorders>
+              <w:top w:val="single" w:color="CBD5E1" w:sz="4"/>
+              <w:left w:val="single" w:color="CBD5E1" w:sz="4"/>
+              <w:bottom w:val="single" w:color="CBD5E1" w:sz="4"/>
+              <w:right w:val="single" w:color="CBD5E1" w:sz="4"/>
+            </w:tcBorders>
+            <w:tcMar>
+              <w:top w:type="dxa" w:w="80"/>
+              <w:left w:type="dxa" w:w="100"/>
+              <w:bottom w:type="dxa" w:w="80"/>
+              <w:right w:type="dxa" w:w="100"/>
+            </w:tcMar>
+          </w:tcPr>
+          <w:p>
+            <w:r>
+              <w:t xml:space="preserve">Д8</w:t>
+            </w:r>
+          </w:p>
+        </w:tc>
+        <w:tc>
+          <w:tcPr>
+            <w:tcW w:type="dxa" w:w="3300"/>
+            <w:tcBorders>
+              <w:top w:val="single" w:color="CBD5E1" w:sz="4"/>
+              <w:left w:val="single" w:color="CBD5E1" w:sz="4"/>
+              <w:bottom w:val="single" w:color="CBD5E1" w:sz="4"/>
+              <w:right w:val="single" w:color="CBD5E1" w:sz="4"/>
+            </w:tcBorders>
+            <w:tcMar>
+              <w:top w:type="dxa" w:w="80"/>
+              <w:left w:type="dxa" w:w="100"/>
+              <w:bottom w:type="dxa" w:w="80"/>
+              <w:right w:type="dxa" w:w="100"/>
+            </w:tcMar>
+          </w:tcPr>
+          <w:p>
+            <w:r>
+              <w:t xml:space="preserve">Этап 2</w:t>
+            </w:r>
+          </w:p>
+        </w:tc>
+      </w:tr>
+      <w:tr>
+        <w:tc>
+          <w:tcPr>
+            <w:tcW w:type="dxa" w:w="700"/>
+            <w:tcBorders>
+              <w:top w:val="single" w:color="CBD5E1" w:sz="4"/>
+              <w:left w:val="single" w:color="CBD5E1" w:sz="4"/>
+              <w:bottom w:val="single" w:color="CBD5E1" w:sz="4"/>
+              <w:right w:val="single" w:color="CBD5E1" w:sz="4"/>
+            </w:tcBorders>
+            <w:tcMar>
+              <w:top w:type="dxa" w:w="80"/>
+              <w:left w:type="dxa" w:w="100"/>
+              <w:bottom w:type="dxa" w:w="80"/>
+              <w:right w:type="dxa" w:w="100"/>
+            </w:tcMar>
+          </w:tcPr>
+          <w:p>
+            <w:r>
               <w:t xml:space="preserve">6</w:t>
             </w:r>
           </w:p>
@@ -785,7 +779,7 @@
           </w:tcPr>
           <w:p>
             <w:r>
-              <w:t xml:space="preserve">Сетевой доступ к MCP-серверу + спецификация интерфейса + учётные данные</w:t>
+              <w:t xml:space="preserve">Сетевой доступ к внутренней RAG-компании + спецификация + учётные данные</w:t>
             </w:r>
           </w:p>
         </w:tc>
@@ -829,7 +823,7 @@
           </w:tcPr>
           <w:p>
             <w:r>
-              <w:t xml:space="preserve">Этап 2</w:t>
+              <w:t xml:space="preserve">Этап 2 — см. открытый вопрос ниже</w:t>
             </w:r>
           </w:p>
         </w:tc>
@@ -875,7 +869,7 @@
           </w:tcPr>
           <w:p>
             <w:r>
-              <w:t xml:space="preserve">Сетевой доступ к внутренней RAG-компании + спецификация + учётные данные</w:t>
+              <w:t xml:space="preserve">Состав и права 2–5 ролей — согласовать заранее, не на ходу</w:t>
             </w:r>
           </w:p>
         </w:tc>
@@ -897,6 +891,192 @@
           </w:tcPr>
           <w:p>
             <w:r>
+              <w:t xml:space="preserve">Совместно</w:t>
+            </w:r>
+          </w:p>
+        </w:tc>
+        <w:tc>
+          <w:tcPr>
+            <w:tcW w:type="dxa" w:w="3300"/>
+            <w:tcBorders>
+              <w:top w:val="single" w:color="CBD5E1" w:sz="4"/>
+              <w:left w:val="single" w:color="CBD5E1" w:sz="4"/>
+              <w:bottom w:val="single" w:color="CBD5E1" w:sz="4"/>
+              <w:right w:val="single" w:color="CBD5E1" w:sz="4"/>
+            </w:tcBorders>
+            <w:tcMar>
+              <w:top w:type="dxa" w:w="80"/>
+              <w:left w:type="dxa" w:w="100"/>
+              <w:bottom w:type="dxa" w:w="80"/>
+              <w:right w:type="dxa" w:w="100"/>
+            </w:tcMar>
+          </w:tcPr>
+          <w:p>
+            <w:r>
+              <w:t xml:space="preserve">Этап 1</w:t>
+            </w:r>
+          </w:p>
+        </w:tc>
+      </w:tr>
+      <w:tr>
+        <w:tc>
+          <w:tcPr>
+            <w:tcW w:type="dxa" w:w="700"/>
+            <w:tcBorders>
+              <w:top w:val="single" w:color="CBD5E1" w:sz="4"/>
+              <w:left w:val="single" w:color="CBD5E1" w:sz="4"/>
+              <w:bottom w:val="single" w:color="CBD5E1" w:sz="4"/>
+              <w:right w:val="single" w:color="CBD5E1" w:sz="4"/>
+            </w:tcBorders>
+            <w:tcMar>
+              <w:top w:type="dxa" w:w="80"/>
+              <w:left w:type="dxa" w:w="100"/>
+              <w:bottom w:type="dxa" w:w="80"/>
+              <w:right w:type="dxa" w:w="100"/>
+            </w:tcMar>
+          </w:tcPr>
+          <w:p>
+            <w:r>
+              <w:t xml:space="preserve">8</w:t>
+            </w:r>
+          </w:p>
+        </w:tc>
+        <w:tc>
+          <w:tcPr>
+            <w:tcW w:type="dxa" w:w="4900"/>
+            <w:tcBorders>
+              <w:top w:val="single" w:color="CBD5E1" w:sz="4"/>
+              <w:left w:val="single" w:color="CBD5E1" w:sz="4"/>
+              <w:bottom w:val="single" w:color="CBD5E1" w:sz="4"/>
+              <w:right w:val="single" w:color="CBD5E1" w:sz="4"/>
+            </w:tcBorders>
+            <w:tcMar>
+              <w:top w:type="dxa" w:w="80"/>
+              <w:left w:type="dxa" w:w="100"/>
+              <w:bottom w:type="dxa" w:w="80"/>
+              <w:right w:type="dxa" w:w="100"/>
+            </w:tcMar>
+          </w:tcPr>
+          <w:p>
+            <w:r>
+              <w:t xml:space="preserve">Состав 2 RAG-коллекций документов</w:t>
+            </w:r>
+          </w:p>
+        </w:tc>
+        <w:tc>
+          <w:tcPr>
+            <w:tcW w:type="dxa" w:w="1800"/>
+            <w:tcBorders>
+              <w:top w:val="single" w:color="CBD5E1" w:sz="4"/>
+              <w:left w:val="single" w:color="CBD5E1" w:sz="4"/>
+              <w:bottom w:val="single" w:color="CBD5E1" w:sz="4"/>
+              <w:right w:val="single" w:color="CBD5E1" w:sz="4"/>
+            </w:tcBorders>
+            <w:tcMar>
+              <w:top w:type="dxa" w:w="80"/>
+              <w:left w:type="dxa" w:w="100"/>
+              <w:bottom w:type="dxa" w:w="80"/>
+              <w:right w:type="dxa" w:w="100"/>
+            </w:tcMar>
+          </w:tcPr>
+          <w:p>
+            <w:r>
+              <w:t xml:space="preserve">Совместно</w:t>
+            </w:r>
+          </w:p>
+        </w:tc>
+        <w:tc>
+          <w:tcPr>
+            <w:tcW w:type="dxa" w:w="3300"/>
+            <w:tcBorders>
+              <w:top w:val="single" w:color="CBD5E1" w:sz="4"/>
+              <w:left w:val="single" w:color="CBD5E1" w:sz="4"/>
+              <w:bottom w:val="single" w:color="CBD5E1" w:sz="4"/>
+              <w:right w:val="single" w:color="CBD5E1" w:sz="4"/>
+            </w:tcBorders>
+            <w:shd w:fill="E6F4EA" w:val="clear"/>
+            <w:tcMar>
+              <w:top w:type="dxa" w:w="80"/>
+              <w:left w:type="dxa" w:w="100"/>
+              <w:bottom w:type="dxa" w:w="80"/>
+              <w:right w:type="dxa" w:w="100"/>
+            </w:tcMar>
+          </w:tcPr>
+          <w:p>
+            <w:r>
+              <w:rPr>
+                <w:b/>
+                <w:bCs/>
+                <w:color w:val="1E7B34"/>
+              </w:rPr>
+              <w:t xml:space="preserve">✅ Загрузка документов идёт, поиск по коллекциям уже работает</w:t>
+            </w:r>
+          </w:p>
+        </w:tc>
+      </w:tr>
+      <w:tr>
+        <w:tc>
+          <w:tcPr>
+            <w:tcW w:type="dxa" w:w="700"/>
+            <w:tcBorders>
+              <w:top w:val="single" w:color="CBD5E1" w:sz="4"/>
+              <w:left w:val="single" w:color="CBD5E1" w:sz="4"/>
+              <w:bottom w:val="single" w:color="CBD5E1" w:sz="4"/>
+              <w:right w:val="single" w:color="CBD5E1" w:sz="4"/>
+            </w:tcBorders>
+            <w:tcMar>
+              <w:top w:type="dxa" w:w="80"/>
+              <w:left w:type="dxa" w:w="100"/>
+              <w:bottom w:type="dxa" w:w="80"/>
+              <w:right w:type="dxa" w:w="100"/>
+            </w:tcMar>
+          </w:tcPr>
+          <w:p>
+            <w:r>
+              <w:t xml:space="preserve">9</w:t>
+            </w:r>
+          </w:p>
+        </w:tc>
+        <w:tc>
+          <w:tcPr>
+            <w:tcW w:type="dxa" w:w="4900"/>
+            <w:tcBorders>
+              <w:top w:val="single" w:color="CBD5E1" w:sz="4"/>
+              <w:left w:val="single" w:color="CBD5E1" w:sz="4"/>
+              <w:bottom w:val="single" w:color="CBD5E1" w:sz="4"/>
+              <w:right w:val="single" w:color="CBD5E1" w:sz="4"/>
+            </w:tcBorders>
+            <w:tcMar>
+              <w:top w:type="dxa" w:w="80"/>
+              <w:left w:type="dxa" w:w="100"/>
+              <w:bottom w:type="dxa" w:w="80"/>
+              <w:right w:type="dxa" w:w="100"/>
+            </w:tcMar>
+          </w:tcPr>
+          <w:p>
+            <w:r>
+              <w:t xml:space="preserve">Пилотная группа — до 20 пользователей на 2 согласованные роли</w:t>
+            </w:r>
+          </w:p>
+        </w:tc>
+        <w:tc>
+          <w:tcPr>
+            <w:tcW w:type="dxa" w:w="1800"/>
+            <w:tcBorders>
+              <w:top w:val="single" w:color="CBD5E1" w:sz="4"/>
+              <w:left w:val="single" w:color="CBD5E1" w:sz="4"/>
+              <w:bottom w:val="single" w:color="CBD5E1" w:sz="4"/>
+              <w:right w:val="single" w:color="CBD5E1" w:sz="4"/>
+            </w:tcBorders>
+            <w:tcMar>
+              <w:top w:type="dxa" w:w="80"/>
+              <w:left w:type="dxa" w:w="100"/>
+              <w:bottom w:type="dxa" w:w="80"/>
+              <w:right w:type="dxa" w:w="100"/>
+            </w:tcMar>
+          </w:tcPr>
+          <w:p>
+            <w:r>
               <w:t xml:space="preserve">Д8</w:t>
             </w:r>
           </w:p>
@@ -919,7 +1099,7 @@
           </w:tcPr>
           <w:p>
             <w:r>
-              <w:t xml:space="preserve">Этап 2 — см. открытый вопрос ниже</w:t>
+              <w:t xml:space="preserve">Этап 3</w:t>
             </w:r>
           </w:p>
         </w:tc>
@@ -943,7 +1123,7 @@
           </w:tcPr>
           <w:p>
             <w:r>
-              <w:t xml:space="preserve">8</w:t>
+              <w:t xml:space="preserve">10</w:t>
             </w:r>
           </w:p>
         </w:tc>
@@ -965,7 +1145,7 @@
           </w:tcPr>
           <w:p>
             <w:r>
-              <w:t xml:space="preserve">Состав и права 2–5 ролей — согласовать заранее, не на ходу</w:t>
+              <w:t xml:space="preserve">Доступ/API-ключ к выбранной облачной LLM для маршрутизации через AI Guard</w:t>
             </w:r>
           </w:p>
         </w:tc>
@@ -987,7 +1167,7 @@
           </w:tcPr>
           <w:p>
             <w:r>
-              <w:t xml:space="preserve">Совместно</w:t>
+              <w:t xml:space="preserve">Д8</w:t>
             </w:r>
           </w:p>
         </w:tc>
@@ -1009,7 +1189,7 @@
           </w:tcPr>
           <w:p>
             <w:r>
-              <w:t xml:space="preserve">Этап 1</w:t>
+              <w:t xml:space="preserve">Этап 2 (ключи получены 04.08.2026, подключение к AI Guard ещё не выполнено)</w:t>
             </w:r>
           </w:p>
         </w:tc>
@@ -1033,277 +1213,7 @@
           </w:tcPr>
           <w:p>
             <w:r>
-              <w:t xml:space="preserve">9</w:t>
-            </w:r>
-          </w:p>
-        </w:tc>
-        <w:tc>
-          <w:tcPr>
-            <w:tcW w:type="dxa" w:w="4900"/>
-            <w:tcBorders>
-              <w:top w:val="single" w:color="CBD5E1" w:sz="4"/>
-              <w:left w:val="single" w:color="CBD5E1" w:sz="4"/>
-              <w:bottom w:val="single" w:color="CBD5E1" w:sz="4"/>
-              <w:right w:val="single" w:color="CBD5E1" w:sz="4"/>
-            </w:tcBorders>
-            <w:tcMar>
-              <w:top w:type="dxa" w:w="80"/>
-              <w:left w:type="dxa" w:w="100"/>
-              <w:bottom w:type="dxa" w:w="80"/>
-              <w:right w:type="dxa" w:w="100"/>
-            </w:tcMar>
-          </w:tcPr>
-          <w:p>
-            <w:r>
-              <w:t xml:space="preserve">Состав 2 RAG-коллекций документов</w:t>
-            </w:r>
-          </w:p>
-        </w:tc>
-        <w:tc>
-          <w:tcPr>
-            <w:tcW w:type="dxa" w:w="1800"/>
-            <w:tcBorders>
-              <w:top w:val="single" w:color="CBD5E1" w:sz="4"/>
-              <w:left w:val="single" w:color="CBD5E1" w:sz="4"/>
-              <w:bottom w:val="single" w:color="CBD5E1" w:sz="4"/>
-              <w:right w:val="single" w:color="CBD5E1" w:sz="4"/>
-            </w:tcBorders>
-            <w:tcMar>
-              <w:top w:type="dxa" w:w="80"/>
-              <w:left w:type="dxa" w:w="100"/>
-              <w:bottom w:type="dxa" w:w="80"/>
-              <w:right w:type="dxa" w:w="100"/>
-            </w:tcMar>
-          </w:tcPr>
-          <w:p>
-            <w:r>
-              <w:t xml:space="preserve">Совместно</w:t>
-            </w:r>
-          </w:p>
-        </w:tc>
-        <w:tc>
-          <w:tcPr>
-            <w:tcW w:type="dxa" w:w="3300"/>
-            <w:tcBorders>
-              <w:top w:val="single" w:color="CBD5E1" w:sz="4"/>
-              <w:left w:val="single" w:color="CBD5E1" w:sz="4"/>
-              <w:bottom w:val="single" w:color="CBD5E1" w:sz="4"/>
-              <w:right w:val="single" w:color="CBD5E1" w:sz="4"/>
-            </w:tcBorders>
-            <w:tcMar>
-              <w:top w:type="dxa" w:w="80"/>
-              <w:left w:type="dxa" w:w="100"/>
-              <w:bottom w:type="dxa" w:w="80"/>
-              <w:right w:type="dxa" w:w="100"/>
-            </w:tcMar>
-          </w:tcPr>
-          <w:p>
-            <w:r>
-              <w:t xml:space="preserve">Этап 1–2</w:t>
-            </w:r>
-          </w:p>
-        </w:tc>
-      </w:tr>
-      <w:tr>
-        <w:tc>
-          <w:tcPr>
-            <w:tcW w:type="dxa" w:w="700"/>
-            <w:tcBorders>
-              <w:top w:val="single" w:color="CBD5E1" w:sz="4"/>
-              <w:left w:val="single" w:color="CBD5E1" w:sz="4"/>
-              <w:bottom w:val="single" w:color="CBD5E1" w:sz="4"/>
-              <w:right w:val="single" w:color="CBD5E1" w:sz="4"/>
-            </w:tcBorders>
-            <w:tcMar>
-              <w:top w:type="dxa" w:w="80"/>
-              <w:left w:type="dxa" w:w="100"/>
-              <w:bottom w:type="dxa" w:w="80"/>
-              <w:right w:type="dxa" w:w="100"/>
-            </w:tcMar>
-          </w:tcPr>
-          <w:p>
-            <w:r>
-              <w:t xml:space="preserve">10</w:t>
-            </w:r>
-          </w:p>
-        </w:tc>
-        <w:tc>
-          <w:tcPr>
-            <w:tcW w:type="dxa" w:w="4900"/>
-            <w:tcBorders>
-              <w:top w:val="single" w:color="CBD5E1" w:sz="4"/>
-              <w:left w:val="single" w:color="CBD5E1" w:sz="4"/>
-              <w:bottom w:val="single" w:color="CBD5E1" w:sz="4"/>
-              <w:right w:val="single" w:color="CBD5E1" w:sz="4"/>
-            </w:tcBorders>
-            <w:tcMar>
-              <w:top w:type="dxa" w:w="80"/>
-              <w:left w:type="dxa" w:w="100"/>
-              <w:bottom w:type="dxa" w:w="80"/>
-              <w:right w:type="dxa" w:w="100"/>
-            </w:tcMar>
-          </w:tcPr>
-          <w:p>
-            <w:r>
-              <w:t xml:space="preserve">Пилотная группа — до 20 пользователей на 2 согласованные роли</w:t>
-            </w:r>
-          </w:p>
-        </w:tc>
-        <w:tc>
-          <w:tcPr>
-            <w:tcW w:type="dxa" w:w="1800"/>
-            <w:tcBorders>
-              <w:top w:val="single" w:color="CBD5E1" w:sz="4"/>
-              <w:left w:val="single" w:color="CBD5E1" w:sz="4"/>
-              <w:bottom w:val="single" w:color="CBD5E1" w:sz="4"/>
-              <w:right w:val="single" w:color="CBD5E1" w:sz="4"/>
-            </w:tcBorders>
-            <w:tcMar>
-              <w:top w:type="dxa" w:w="80"/>
-              <w:left w:type="dxa" w:w="100"/>
-              <w:bottom w:type="dxa" w:w="80"/>
-              <w:right w:type="dxa" w:w="100"/>
-            </w:tcMar>
-          </w:tcPr>
-          <w:p>
-            <w:r>
-              <w:t xml:space="preserve">Д8</w:t>
-            </w:r>
-          </w:p>
-        </w:tc>
-        <w:tc>
-          <w:tcPr>
-            <w:tcW w:type="dxa" w:w="3300"/>
-            <w:tcBorders>
-              <w:top w:val="single" w:color="CBD5E1" w:sz="4"/>
-              <w:left w:val="single" w:color="CBD5E1" w:sz="4"/>
-              <w:bottom w:val="single" w:color="CBD5E1" w:sz="4"/>
-              <w:right w:val="single" w:color="CBD5E1" w:sz="4"/>
-            </w:tcBorders>
-            <w:tcMar>
-              <w:top w:type="dxa" w:w="80"/>
-              <w:left w:type="dxa" w:w="100"/>
-              <w:bottom w:type="dxa" w:w="80"/>
-              <w:right w:type="dxa" w:w="100"/>
-            </w:tcMar>
-          </w:tcPr>
-          <w:p>
-            <w:r>
-              <w:t xml:space="preserve">Этап 3</w:t>
-            </w:r>
-          </w:p>
-        </w:tc>
-      </w:tr>
-      <w:tr>
-        <w:tc>
-          <w:tcPr>
-            <w:tcW w:type="dxa" w:w="700"/>
-            <w:tcBorders>
-              <w:top w:val="single" w:color="CBD5E1" w:sz="4"/>
-              <w:left w:val="single" w:color="CBD5E1" w:sz="4"/>
-              <w:bottom w:val="single" w:color="CBD5E1" w:sz="4"/>
-              <w:right w:val="single" w:color="CBD5E1" w:sz="4"/>
-            </w:tcBorders>
-            <w:tcMar>
-              <w:top w:type="dxa" w:w="80"/>
-              <w:left w:type="dxa" w:w="100"/>
-              <w:bottom w:type="dxa" w:w="80"/>
-              <w:right w:type="dxa" w:w="100"/>
-            </w:tcMar>
-          </w:tcPr>
-          <w:p>
-            <w:r>
               <w:t xml:space="preserve">11</w:t>
-            </w:r>
-          </w:p>
-        </w:tc>
-        <w:tc>
-          <w:tcPr>
-            <w:tcW w:type="dxa" w:w="4900"/>
-            <w:tcBorders>
-              <w:top w:val="single" w:color="CBD5E1" w:sz="4"/>
-              <w:left w:val="single" w:color="CBD5E1" w:sz="4"/>
-              <w:bottom w:val="single" w:color="CBD5E1" w:sz="4"/>
-              <w:right w:val="single" w:color="CBD5E1" w:sz="4"/>
-            </w:tcBorders>
-            <w:tcMar>
-              <w:top w:type="dxa" w:w="80"/>
-              <w:left w:type="dxa" w:w="100"/>
-              <w:bottom w:type="dxa" w:w="80"/>
-              <w:right w:type="dxa" w:w="100"/>
-            </w:tcMar>
-          </w:tcPr>
-          <w:p>
-            <w:r>
-              <w:t xml:space="preserve">Доступ/API-ключ к выбранной облачной LLM для маршрутизации через AI Guard</w:t>
-            </w:r>
-          </w:p>
-        </w:tc>
-        <w:tc>
-          <w:tcPr>
-            <w:tcW w:type="dxa" w:w="1800"/>
-            <w:tcBorders>
-              <w:top w:val="single" w:color="CBD5E1" w:sz="4"/>
-              <w:left w:val="single" w:color="CBD5E1" w:sz="4"/>
-              <w:bottom w:val="single" w:color="CBD5E1" w:sz="4"/>
-              <w:right w:val="single" w:color="CBD5E1" w:sz="4"/>
-            </w:tcBorders>
-            <w:tcMar>
-              <w:top w:type="dxa" w:w="80"/>
-              <w:left w:type="dxa" w:w="100"/>
-              <w:bottom w:type="dxa" w:w="80"/>
-              <w:right w:type="dxa" w:w="100"/>
-            </w:tcMar>
-          </w:tcPr>
-          <w:p>
-            <w:r>
-              <w:t xml:space="preserve">Д8</w:t>
-            </w:r>
-          </w:p>
-        </w:tc>
-        <w:tc>
-          <w:tcPr>
-            <w:tcW w:type="dxa" w:w="3300"/>
-            <w:tcBorders>
-              <w:top w:val="single" w:color="CBD5E1" w:sz="4"/>
-              <w:left w:val="single" w:color="CBD5E1" w:sz="4"/>
-              <w:bottom w:val="single" w:color="CBD5E1" w:sz="4"/>
-              <w:right w:val="single" w:color="CBD5E1" w:sz="4"/>
-            </w:tcBorders>
-            <w:tcMar>
-              <w:top w:type="dxa" w:w="80"/>
-              <w:left w:type="dxa" w:w="100"/>
-              <w:bottom w:type="dxa" w:w="80"/>
-              <w:right w:type="dxa" w:w="100"/>
-            </w:tcMar>
-          </w:tcPr>
-          <w:p>
-            <w:r>
-              <w:t xml:space="preserve">Этап 2 (ключи получены 04.08.2026, подключение к AI Guard ещё не выполнено)</w:t>
-            </w:r>
-          </w:p>
-        </w:tc>
-      </w:tr>
-      <w:tr>
-        <w:tc>
-          <w:tcPr>
-            <w:tcW w:type="dxa" w:w="700"/>
-            <w:tcBorders>
-              <w:top w:val="single" w:color="CBD5E1" w:sz="4"/>
-              <w:left w:val="single" w:color="CBD5E1" w:sz="4"/>
-              <w:bottom w:val="single" w:color="CBD5E1" w:sz="4"/>
-              <w:right w:val="single" w:color="CBD5E1" w:sz="4"/>
-            </w:tcBorders>
-            <w:tcMar>
-              <w:top w:type="dxa" w:w="80"/>
-              <w:left w:type="dxa" w:w="100"/>
-              <w:bottom w:type="dxa" w:w="80"/>
-              <w:right w:type="dxa" w:w="100"/>
-            </w:tcMar>
-          </w:tcPr>
-          <w:p>
-            <w:r>
-              <w:t xml:space="preserve">12</w:t>
             </w:r>
           </w:p>
         </w:tc>
@@ -1689,7 +1599,7 @@
           </w:tcPr>
           <w:p>
             <w:r>
-              <w:t xml:space="preserve">Выделение инфраструктуры (серверы/ВМ, GPU под эмбеддеры, контейнерная среда)</w:t>
+              <w:t xml:space="preserve">Выделение инфраструктуры (сервер под СУБД+платформу, GPU под эмбеддеры, контейнерная среда)</w:t>
             </w:r>
           </w:p>
         </w:tc>
@@ -1724,7 +1634,7 @@
               <w:bottom w:val="single" w:color="CBD5E1" w:sz="4"/>
               <w:right w:val="single" w:color="CBD5E1" w:sz="4"/>
             </w:tcBorders>
-            <w:shd w:fill="FDF0E1" w:val="clear"/>
+            <w:shd w:fill="E6F4EA" w:val="clear"/>
             <w:tcMar>
               <w:top w:type="dxa" w:w="80"/>
               <w:left w:type="dxa" w:w="100"/>
@@ -1737,9 +1647,9 @@
               <w:rPr>
                 <w:b/>
                 <w:bCs/>
-                <w:color w:val="B45309"/>
+                <w:color w:val="1E7B34"/>
               </w:rPr>
-              <w:t xml:space="preserve">⏳ Частично — сервер/ВМ под СУБД и GPU (п.1 чек-листа) не подтверждён</w:t>
+              <w:t xml:space="preserve">✅ Подтверждено — один общий сервер вместо двух раздельных по ТЗ</w:t>
             </w:r>
           </w:p>
         </w:tc>
@@ -1911,6 +1821,80 @@
           </w:tcPr>
           <w:p>
             <w:r>
+              <w:t xml:space="preserve">Загрузка документов в RAG-коллекции</w:t>
+            </w:r>
+          </w:p>
+        </w:tc>
+        <w:tc>
+          <w:tcPr>
+            <w:tcW w:type="dxa" w:w="3500"/>
+            <w:tcBorders>
+              <w:top w:val="single" w:color="CBD5E1" w:sz="4"/>
+              <w:left w:val="single" w:color="CBD5E1" w:sz="4"/>
+              <w:bottom w:val="single" w:color="CBD5E1" w:sz="4"/>
+              <w:right w:val="single" w:color="CBD5E1" w:sz="4"/>
+            </w:tcBorders>
+            <w:tcMar>
+              <w:top w:type="dxa" w:w="80"/>
+              <w:left w:type="dxa" w:w="100"/>
+              <w:bottom w:type="dxa" w:w="80"/>
+              <w:right w:type="dxa" w:w="100"/>
+            </w:tcMar>
+          </w:tcPr>
+          <w:p>
+            <w:r>
+              <w:t xml:space="preserve">АйТиКью Про</w:t>
+            </w:r>
+          </w:p>
+        </w:tc>
+        <w:tc>
+          <w:tcPr>
+            <w:tcW w:type="dxa" w:w="3000"/>
+            <w:tcBorders>
+              <w:top w:val="single" w:color="CBD5E1" w:sz="4"/>
+              <w:left w:val="single" w:color="CBD5E1" w:sz="4"/>
+              <w:bottom w:val="single" w:color="CBD5E1" w:sz="4"/>
+              <w:right w:val="single" w:color="CBD5E1" w:sz="4"/>
+            </w:tcBorders>
+            <w:shd w:fill="E6F4EA" w:val="clear"/>
+            <w:tcMar>
+              <w:top w:type="dxa" w:w="80"/>
+              <w:left w:type="dxa" w:w="100"/>
+              <w:bottom w:type="dxa" w:w="80"/>
+              <w:right w:type="dxa" w:w="100"/>
+            </w:tcMar>
+          </w:tcPr>
+          <w:p>
+            <w:r>
+              <w:rPr>
+                <w:b/>
+                <w:bCs/>
+                <w:color w:val="1E7B34"/>
+              </w:rPr>
+              <w:t xml:space="preserve">✅ Идёт, поиск по коллекциям уже работает</w:t>
+            </w:r>
+          </w:p>
+        </w:tc>
+      </w:tr>
+      <w:tr>
+        <w:tc>
+          <w:tcPr>
+            <w:tcW w:type="dxa" w:w="5200"/>
+            <w:tcBorders>
+              <w:top w:val="single" w:color="CBD5E1" w:sz="4"/>
+              <w:left w:val="single" w:color="CBD5E1" w:sz="4"/>
+              <w:bottom w:val="single" w:color="CBD5E1" w:sz="4"/>
+              <w:right w:val="single" w:color="CBD5E1" w:sz="4"/>
+            </w:tcBorders>
+            <w:tcMar>
+              <w:top w:type="dxa" w:w="80"/>
+              <w:left w:type="dxa" w:w="100"/>
+              <w:bottom w:type="dxa" w:w="80"/>
+              <w:right w:type="dxa" w:w="100"/>
+            </w:tcMar>
+          </w:tcPr>
+          <w:p>
+            <w:r>
               <w:t xml:space="preserve">Установка и базовая настройка платформы на стенде</w:t>
             </w:r>
           </w:p>
@@ -2053,7 +2037,7 @@
         <w:t xml:space="preserve">Результат этапа получен частично</w:t>
       </w:r>
       <w:r>
-        <w:t xml:space="preserve">: сервер под платформу и контейнерная среда развёрнуты (по факту 32 ГБ RAM / 100 ГБ SSD вместо заявленных 64/200, докраивали место по ходу установки; Docker разворачивали собственными силами), состав ролей и RAG-коллекций согласован, пробный запуск проведён. Открытым остаётся сервер/ВМ под СУБД и GPU (статус не известен) и доступ к КХД/ESB — без них Этап 1 не может считаться закрытым, и официальный отсчёт 6-недельного пилота не запущен.</w:t>
+        <w:t xml:space="preserve">: вся инфраструктура (сервер под СУБД+платформу, контейнерная среда) подтверждена и развёрнута — по факту это один общий сервер (≈8 vCPU, 32 ГБ RAM, 100 ГБ SSD), а не два раздельных, как изначально предполагалось по ТЗ; Docker разворачивали собственными силами. Состав ролей и RAG-коллекций согласован, загрузка документов в RAG идёт, поиск по коллекциям уже работает, пробный запуск проведён. Единственное, что остаётся открытым для закрытия Этапа 1 — доступ к КХД/ESB: без него официальный отсчёт 6-недельного пилота не запущен.</w:t>
       </w:r>
     </w:p>
     <w:p>
@@ -3647,7 +3631,7 @@
           </w:tcPr>
           <w:p>
             <w:r>
-              <w:t xml:space="preserve">Дни 5–7</w:t>
+              <w:t xml:space="preserve">✅ Идёт (стартовало раньше графика — ещё на Этапе 1)</w:t>
             </w:r>
           </w:p>
         </w:tc>
@@ -3715,7 +3699,7 @@
           </w:tcPr>
           <w:p>
             <w:r>
-              <w:t xml:space="preserve">Дни 7–9</w:t>
+              <w:t xml:space="preserve">✅ Поиск по коллекциям уже работает</w:t>
             </w:r>
           </w:p>
         </w:tc>
@@ -7021,7 +7005,7 @@
         </w:numPr>
         <w:spacing w:after="120"/>
       </w:pPr>
-      <w:hyperlink w:history="1" r:id="rIdl4ceei89t4jsle-lxeg6a">
+      <w:hyperlink w:history="1" r:id="rIdqo40fi_dywvpw0agpibsu">
         <w:r>
           <w:rPr>
             <w:rStyle w:val="Hyperlink"/>
@@ -7043,7 +7027,7 @@
         </w:numPr>
         <w:spacing w:after="120"/>
       </w:pPr>
-      <w:hyperlink w:history="1" r:id="rIdfgdbplg6wculyw70l4h-t">
+      <w:hyperlink w:history="1" r:id="rIdlonewooqm_z4pdplmzmvl">
         <w:r>
           <w:rPr>
             <w:rStyle w:val="Hyperlink"/>
@@ -7065,7 +7049,7 @@
         </w:numPr>
         <w:spacing w:after="120"/>
       </w:pPr>
-      <w:hyperlink w:history="1" r:id="rIdw53ly1yekkenx0k4zedpg">
+      <w:hyperlink w:history="1" r:id="rIdqrx7udrfnh5d6zjqjk-wg">
         <w:r>
           <w:rPr>
             <w:rStyle w:val="Hyperlink"/>
@@ -7077,7 +7061,7 @@
       <w:r>
         <w:t xml:space="preserve">, </w:t>
       </w:r>
-      <w:hyperlink w:history="1" r:id="rId9etm3_cxtpm-kok19ms8d">
+      <w:hyperlink w:history="1" r:id="rIdyov-1jicjmtqd-st9yomt">
         <w:r>
           <w:rPr>
             <w:rStyle w:val="Hyperlink"/>

</xml_diff>

<commit_message>
Add explicit slip-reason callout and plan-vs-actual schedule table
Section 0 previously stated the schedule slip without naming a cause.
Adds a labeled "Причина съезда сроков" explanation (КХД/ESB access, the
only open blocker) and a compact per-stage table with planned duration,
planned dates, and current status, so the schedule and its cause are
visible in one place rather than buried in prose.
</commit_message>
<xml_diff>
--- a/docs/analysis/case-03-pilot-execution-plan.docx
+++ b/docs/analysis/case-03-pilot-execution-plan.docx
@@ -118,6 +118,547 @@
       </w:r>
       <w:r>
         <w:t xml:space="preserve"> — как только доступ откроется, календарь ниже пересчитывается от новой фактической даты. 27.07–04.08 засчитываются как подготовительная работа, не блокированная доступом (провижининг серверов, обсуждение состава ролей), но не входят в 6-недельный счётчик пилота.</w:t>
+      </w:r>
+    </w:p>
+    <w:p>
+      <w:pPr>
+        <w:spacing w:after="120"/>
+      </w:pPr>
+      <w:r>
+        <w:rPr>
+          <w:b/>
+          <w:bCs/>
+        </w:rPr>
+        <w:t xml:space="preserve">Причина съезда сроков</w:t>
+      </w:r>
+      <w:r>
+        <w:t xml:space="preserve">: единственная причина текущего отставания — доступ к КХД/ESB со стороны заказчика (Д8), который по плану должен был быть открыт к 31.07.2026, но по состоянию на 04.08.2026 так и не предоставлен. Все остальные подготовительные работы (инфраструктура, состав ролей, RAG-коллекции) выполнены в срок или с опережением графика — см. Этап 1 ниже. Это единственный блокер, от которого зависит сдвиг всего последующего календаря.</w:t>
+      </w:r>
+    </w:p>
+    <w:p>
+      <w:pPr>
+        <w:spacing w:after="120"/>
+      </w:pPr>
+      <w:r>
+        <w:rPr>
+          <w:b/>
+          <w:bCs/>
+        </w:rPr>
+        <w:t xml:space="preserve">Плановые и фактические сроки по этапам</w:t>
+      </w:r>
+    </w:p>
+    <w:tbl>
+      <w:tblPr>
+        <w:tblW w:type="dxa" w:w="10080"/>
+        <w:tblBorders>
+          <w:top w:val="single" w:color="auto" w:sz="4"/>
+          <w:left w:val="single" w:color="auto" w:sz="4"/>
+          <w:bottom w:val="single" w:color="auto" w:sz="4"/>
+          <w:right w:val="single" w:color="auto" w:sz="4"/>
+          <w:insideH w:val="single" w:color="auto" w:sz="4"/>
+          <w:insideV w:val="single" w:color="auto" w:sz="4"/>
+        </w:tblBorders>
+      </w:tblPr>
+      <w:tblGrid>
+        <w:gridCol w:w="3200"/>
+        <w:gridCol w:w="1700"/>
+        <w:gridCol w:w="2900"/>
+        <w:gridCol w:w="3900"/>
+      </w:tblGrid>
+      <w:tr>
+        <w:trPr>
+          <w:tblHeader/>
+        </w:trPr>
+        <w:tc>
+          <w:tcPr>
+            <w:tcW w:type="dxa" w:w="3200"/>
+            <w:tcBorders>
+              <w:top w:val="single" w:color="CBD5E1" w:sz="4"/>
+              <w:left w:val="single" w:color="CBD5E1" w:sz="4"/>
+              <w:bottom w:val="single" w:color="CBD5E1" w:sz="4"/>
+              <w:right w:val="single" w:color="CBD5E1" w:sz="4"/>
+            </w:tcBorders>
+            <w:shd w:fill="1A2B4C" w:val="clear"/>
+            <w:tcMar>
+              <w:top w:type="dxa" w:w="80"/>
+              <w:left w:type="dxa" w:w="100"/>
+              <w:bottom w:type="dxa" w:w="80"/>
+              <w:right w:type="dxa" w:w="100"/>
+            </w:tcMar>
+          </w:tcPr>
+          <w:p>
+            <w:r>
+              <w:rPr>
+                <w:b/>
+                <w:bCs/>
+                <w:color w:val="FFFFFF"/>
+              </w:rPr>
+              <w:t xml:space="preserve">Этап</w:t>
+            </w:r>
+          </w:p>
+        </w:tc>
+        <w:tc>
+          <w:tcPr>
+            <w:tcW w:type="dxa" w:w="1700"/>
+            <w:tcBorders>
+              <w:top w:val="single" w:color="CBD5E1" w:sz="4"/>
+              <w:left w:val="single" w:color="CBD5E1" w:sz="4"/>
+              <w:bottom w:val="single" w:color="CBD5E1" w:sz="4"/>
+              <w:right w:val="single" w:color="CBD5E1" w:sz="4"/>
+            </w:tcBorders>
+            <w:shd w:fill="1A2B4C" w:val="clear"/>
+            <w:tcMar>
+              <w:top w:type="dxa" w:w="80"/>
+              <w:left w:type="dxa" w:w="100"/>
+              <w:bottom w:type="dxa" w:w="80"/>
+              <w:right w:type="dxa" w:w="100"/>
+            </w:tcMar>
+          </w:tcPr>
+          <w:p>
+            <w:r>
+              <w:rPr>
+                <w:b/>
+                <w:bCs/>
+                <w:color w:val="FFFFFF"/>
+              </w:rPr>
+              <w:t xml:space="preserve">Плановая длительность</w:t>
+            </w:r>
+          </w:p>
+        </w:tc>
+        <w:tc>
+          <w:tcPr>
+            <w:tcW w:type="dxa" w:w="2900"/>
+            <w:tcBorders>
+              <w:top w:val="single" w:color="CBD5E1" w:sz="4"/>
+              <w:left w:val="single" w:color="CBD5E1" w:sz="4"/>
+              <w:bottom w:val="single" w:color="CBD5E1" w:sz="4"/>
+              <w:right w:val="single" w:color="CBD5E1" w:sz="4"/>
+            </w:tcBorders>
+            <w:shd w:fill="1A2B4C" w:val="clear"/>
+            <w:tcMar>
+              <w:top w:type="dxa" w:w="80"/>
+              <w:left w:type="dxa" w:w="100"/>
+              <w:bottom w:type="dxa" w:w="80"/>
+              <w:right w:type="dxa" w:w="100"/>
+            </w:tcMar>
+          </w:tcPr>
+          <w:p>
+            <w:r>
+              <w:rPr>
+                <w:b/>
+                <w:bCs/>
+                <w:color w:val="FFFFFF"/>
+              </w:rPr>
+              <w:t xml:space="preserve">Плановые даты (от целевого Дня 1 = 31.07)</w:t>
+            </w:r>
+          </w:p>
+        </w:tc>
+        <w:tc>
+          <w:tcPr>
+            <w:tcW w:type="dxa" w:w="3900"/>
+            <w:tcBorders>
+              <w:top w:val="single" w:color="CBD5E1" w:sz="4"/>
+              <w:left w:val="single" w:color="CBD5E1" w:sz="4"/>
+              <w:bottom w:val="single" w:color="CBD5E1" w:sz="4"/>
+              <w:right w:val="single" w:color="CBD5E1" w:sz="4"/>
+            </w:tcBorders>
+            <w:shd w:fill="1A2B4C" w:val="clear"/>
+            <w:tcMar>
+              <w:top w:type="dxa" w:w="80"/>
+              <w:left w:type="dxa" w:w="100"/>
+              <w:bottom w:type="dxa" w:w="80"/>
+              <w:right w:type="dxa" w:w="100"/>
+            </w:tcMar>
+          </w:tcPr>
+          <w:p>
+            <w:r>
+              <w:rPr>
+                <w:b/>
+                <w:bCs/>
+                <w:color w:val="FFFFFF"/>
+              </w:rPr>
+              <w:t xml:space="preserve">Факт на 04.08.2026</w:t>
+            </w:r>
+          </w:p>
+        </w:tc>
+      </w:tr>
+      <w:tr>
+        <w:tc>
+          <w:tcPr>
+            <w:tcW w:type="dxa" w:w="3200"/>
+            <w:tcBorders>
+              <w:top w:val="single" w:color="CBD5E1" w:sz="4"/>
+              <w:left w:val="single" w:color="CBD5E1" w:sz="4"/>
+              <w:bottom w:val="single" w:color="CBD5E1" w:sz="4"/>
+              <w:right w:val="single" w:color="CBD5E1" w:sz="4"/>
+            </w:tcBorders>
+            <w:tcMar>
+              <w:top w:type="dxa" w:w="80"/>
+              <w:left w:type="dxa" w:w="100"/>
+              <w:bottom w:type="dxa" w:w="80"/>
+              <w:right w:type="dxa" w:w="100"/>
+            </w:tcMar>
+          </w:tcPr>
+          <w:p>
+            <w:r>
+              <w:t xml:space="preserve">Этап 1 — Подготовка и развёртывание</w:t>
+            </w:r>
+          </w:p>
+        </w:tc>
+        <w:tc>
+          <w:tcPr>
+            <w:tcW w:type="dxa" w:w="1700"/>
+            <w:tcBorders>
+              <w:top w:val="single" w:color="CBD5E1" w:sz="4"/>
+              <w:left w:val="single" w:color="CBD5E1" w:sz="4"/>
+              <w:bottom w:val="single" w:color="CBD5E1" w:sz="4"/>
+              <w:right w:val="single" w:color="CBD5E1" w:sz="4"/>
+            </w:tcBorders>
+            <w:tcMar>
+              <w:top w:type="dxa" w:w="80"/>
+              <w:left w:type="dxa" w:w="100"/>
+              <w:bottom w:type="dxa" w:w="80"/>
+              <w:right w:type="dxa" w:w="100"/>
+            </w:tcMar>
+          </w:tcPr>
+          <w:p>
+            <w:r>
+              <w:t xml:space="preserve">7 дней</w:t>
+            </w:r>
+          </w:p>
+        </w:tc>
+        <w:tc>
+          <w:tcPr>
+            <w:tcW w:type="dxa" w:w="2900"/>
+            <w:tcBorders>
+              <w:top w:val="single" w:color="CBD5E1" w:sz="4"/>
+              <w:left w:val="single" w:color="CBD5E1" w:sz="4"/>
+              <w:bottom w:val="single" w:color="CBD5E1" w:sz="4"/>
+              <w:right w:val="single" w:color="CBD5E1" w:sz="4"/>
+            </w:tcBorders>
+            <w:tcMar>
+              <w:top w:type="dxa" w:w="80"/>
+              <w:left w:type="dxa" w:w="100"/>
+              <w:bottom w:type="dxa" w:w="80"/>
+              <w:right w:type="dxa" w:w="100"/>
+            </w:tcMar>
+          </w:tcPr>
+          <w:p>
+            <w:r>
+              <w:t xml:space="preserve">31.07–06.08.2026</w:t>
+            </w:r>
+          </w:p>
+        </w:tc>
+        <w:tc>
+          <w:tcPr>
+            <w:tcW w:type="dxa" w:w="3900"/>
+            <w:tcBorders>
+              <w:top w:val="single" w:color="CBD5E1" w:sz="4"/>
+              <w:left w:val="single" w:color="CBD5E1" w:sz="4"/>
+              <w:bottom w:val="single" w:color="CBD5E1" w:sz="4"/>
+              <w:right w:val="single" w:color="CBD5E1" w:sz="4"/>
+            </w:tcBorders>
+            <w:shd w:fill="FDF0E1" w:val="clear"/>
+            <w:tcMar>
+              <w:top w:type="dxa" w:w="80"/>
+              <w:left w:type="dxa" w:w="100"/>
+              <w:bottom w:type="dxa" w:w="80"/>
+              <w:right w:type="dxa" w:w="100"/>
+            </w:tcMar>
+          </w:tcPr>
+          <w:p>
+            <w:r>
+              <w:rPr>
+                <w:b/>
+                <w:bCs/>
+                <w:color w:val="B45309"/>
+              </w:rPr>
+              <w:t xml:space="preserve">⏳ В процессе, заблокирован — не закрыт из-за отсутствия доступа к КХД/ESB</w:t>
+            </w:r>
+          </w:p>
+        </w:tc>
+      </w:tr>
+      <w:tr>
+        <w:tc>
+          <w:tcPr>
+            <w:tcW w:type="dxa" w:w="3200"/>
+            <w:tcBorders>
+              <w:top w:val="single" w:color="CBD5E1" w:sz="4"/>
+              <w:left w:val="single" w:color="CBD5E1" w:sz="4"/>
+              <w:bottom w:val="single" w:color="CBD5E1" w:sz="4"/>
+              <w:right w:val="single" w:color="CBD5E1" w:sz="4"/>
+            </w:tcBorders>
+            <w:tcMar>
+              <w:top w:type="dxa" w:w="80"/>
+              <w:left w:type="dxa" w:w="100"/>
+              <w:bottom w:type="dxa" w:w="80"/>
+              <w:right w:type="dxa" w:w="100"/>
+            </w:tcMar>
+          </w:tcPr>
+          <w:p>
+            <w:r>
+              <w:t xml:space="preserve">Этап 2 — Интеграция</w:t>
+            </w:r>
+          </w:p>
+        </w:tc>
+        <w:tc>
+          <w:tcPr>
+            <w:tcW w:type="dxa" w:w="1700"/>
+            <w:tcBorders>
+              <w:top w:val="single" w:color="CBD5E1" w:sz="4"/>
+              <w:left w:val="single" w:color="CBD5E1" w:sz="4"/>
+              <w:bottom w:val="single" w:color="CBD5E1" w:sz="4"/>
+              <w:right w:val="single" w:color="CBD5E1" w:sz="4"/>
+            </w:tcBorders>
+            <w:tcMar>
+              <w:top w:type="dxa" w:w="80"/>
+              <w:left w:type="dxa" w:w="100"/>
+              <w:bottom w:type="dxa" w:w="80"/>
+              <w:right w:type="dxa" w:w="100"/>
+            </w:tcMar>
+          </w:tcPr>
+          <w:p>
+            <w:r>
+              <w:t xml:space="preserve">14 дней</w:t>
+            </w:r>
+          </w:p>
+        </w:tc>
+        <w:tc>
+          <w:tcPr>
+            <w:tcW w:type="dxa" w:w="2900"/>
+            <w:tcBorders>
+              <w:top w:val="single" w:color="CBD5E1" w:sz="4"/>
+              <w:left w:val="single" w:color="CBD5E1" w:sz="4"/>
+              <w:bottom w:val="single" w:color="CBD5E1" w:sz="4"/>
+              <w:right w:val="single" w:color="CBD5E1" w:sz="4"/>
+            </w:tcBorders>
+            <w:tcMar>
+              <w:top w:type="dxa" w:w="80"/>
+              <w:left w:type="dxa" w:w="100"/>
+              <w:bottom w:type="dxa" w:w="80"/>
+              <w:right w:type="dxa" w:w="100"/>
+            </w:tcMar>
+          </w:tcPr>
+          <w:p>
+            <w:r>
+              <w:t xml:space="preserve">07.08–20.08.2026</w:t>
+            </w:r>
+          </w:p>
+        </w:tc>
+        <w:tc>
+          <w:tcPr>
+            <w:tcW w:type="dxa" w:w="3900"/>
+            <w:tcBorders>
+              <w:top w:val="single" w:color="CBD5E1" w:sz="4"/>
+              <w:left w:val="single" w:color="CBD5E1" w:sz="4"/>
+              <w:bottom w:val="single" w:color="CBD5E1" w:sz="4"/>
+              <w:right w:val="single" w:color="CBD5E1" w:sz="4"/>
+            </w:tcBorders>
+            <w:tcMar>
+              <w:top w:type="dxa" w:w="80"/>
+              <w:left w:type="dxa" w:w="100"/>
+              <w:bottom w:type="dxa" w:w="80"/>
+              <w:right w:type="dxa" w:w="100"/>
+            </w:tcMar>
+          </w:tcPr>
+          <w:p>
+            <w:r>
+              <w:t xml:space="preserve">Не начат — стартует только после закрытия Этапа 1</w:t>
+            </w:r>
+          </w:p>
+        </w:tc>
+      </w:tr>
+      <w:tr>
+        <w:tc>
+          <w:tcPr>
+            <w:tcW w:type="dxa" w:w="3200"/>
+            <w:tcBorders>
+              <w:top w:val="single" w:color="CBD5E1" w:sz="4"/>
+              <w:left w:val="single" w:color="CBD5E1" w:sz="4"/>
+              <w:bottom w:val="single" w:color="CBD5E1" w:sz="4"/>
+              <w:right w:val="single" w:color="CBD5E1" w:sz="4"/>
+            </w:tcBorders>
+            <w:tcMar>
+              <w:top w:type="dxa" w:w="80"/>
+              <w:left w:type="dxa" w:w="100"/>
+              <w:bottom w:type="dxa" w:w="80"/>
+              <w:right w:type="dxa" w:w="100"/>
+            </w:tcMar>
+          </w:tcPr>
+          <w:p>
+            <w:r>
+              <w:t xml:space="preserve">Этап 3 — Опытная эксплуатация</w:t>
+            </w:r>
+          </w:p>
+        </w:tc>
+        <w:tc>
+          <w:tcPr>
+            <w:tcW w:type="dxa" w:w="1700"/>
+            <w:tcBorders>
+              <w:top w:val="single" w:color="CBD5E1" w:sz="4"/>
+              <w:left w:val="single" w:color="CBD5E1" w:sz="4"/>
+              <w:bottom w:val="single" w:color="CBD5E1" w:sz="4"/>
+              <w:right w:val="single" w:color="CBD5E1" w:sz="4"/>
+            </w:tcBorders>
+            <w:tcMar>
+              <w:top w:type="dxa" w:w="80"/>
+              <w:left w:type="dxa" w:w="100"/>
+              <w:bottom w:type="dxa" w:w="80"/>
+              <w:right w:type="dxa" w:w="100"/>
+            </w:tcMar>
+          </w:tcPr>
+          <w:p>
+            <w:r>
+              <w:t xml:space="preserve">14 дней</w:t>
+            </w:r>
+          </w:p>
+        </w:tc>
+        <w:tc>
+          <w:tcPr>
+            <w:tcW w:type="dxa" w:w="2900"/>
+            <w:tcBorders>
+              <w:top w:val="single" w:color="CBD5E1" w:sz="4"/>
+              <w:left w:val="single" w:color="CBD5E1" w:sz="4"/>
+              <w:bottom w:val="single" w:color="CBD5E1" w:sz="4"/>
+              <w:right w:val="single" w:color="CBD5E1" w:sz="4"/>
+            </w:tcBorders>
+            <w:tcMar>
+              <w:top w:type="dxa" w:w="80"/>
+              <w:left w:type="dxa" w:w="100"/>
+              <w:bottom w:type="dxa" w:w="80"/>
+              <w:right w:type="dxa" w:w="100"/>
+            </w:tcMar>
+          </w:tcPr>
+          <w:p>
+            <w:r>
+              <w:t xml:space="preserve">21.08–03.09.2026</w:t>
+            </w:r>
+          </w:p>
+        </w:tc>
+        <w:tc>
+          <w:tcPr>
+            <w:tcW w:type="dxa" w:w="3900"/>
+            <w:tcBorders>
+              <w:top w:val="single" w:color="CBD5E1" w:sz="4"/>
+              <w:left w:val="single" w:color="CBD5E1" w:sz="4"/>
+              <w:bottom w:val="single" w:color="CBD5E1" w:sz="4"/>
+              <w:right w:val="single" w:color="CBD5E1" w:sz="4"/>
+            </w:tcBorders>
+            <w:tcMar>
+              <w:top w:type="dxa" w:w="80"/>
+              <w:left w:type="dxa" w:w="100"/>
+              <w:bottom w:type="dxa" w:w="80"/>
+              <w:right w:type="dxa" w:w="100"/>
+            </w:tcMar>
+          </w:tcPr>
+          <w:p>
+            <w:r>
+              <w:t xml:space="preserve">Не начат — сдвигается на тот же срок, что и Этап 1</w:t>
+            </w:r>
+          </w:p>
+        </w:tc>
+      </w:tr>
+      <w:tr>
+        <w:tc>
+          <w:tcPr>
+            <w:tcW w:type="dxa" w:w="3200"/>
+            <w:tcBorders>
+              <w:top w:val="single" w:color="CBD5E1" w:sz="4"/>
+              <w:left w:val="single" w:color="CBD5E1" w:sz="4"/>
+              <w:bottom w:val="single" w:color="CBD5E1" w:sz="4"/>
+              <w:right w:val="single" w:color="CBD5E1" w:sz="4"/>
+            </w:tcBorders>
+            <w:tcMar>
+              <w:top w:type="dxa" w:w="80"/>
+              <w:left w:type="dxa" w:w="100"/>
+              <w:bottom w:type="dxa" w:w="80"/>
+              <w:right w:type="dxa" w:w="100"/>
+            </w:tcMar>
+          </w:tcPr>
+          <w:p>
+            <w:r>
+              <w:t xml:space="preserve">Этап 4 — Оценка и отчёт</w:t>
+            </w:r>
+          </w:p>
+        </w:tc>
+        <w:tc>
+          <w:tcPr>
+            <w:tcW w:type="dxa" w:w="1700"/>
+            <w:tcBorders>
+              <w:top w:val="single" w:color="CBD5E1" w:sz="4"/>
+              <w:left w:val="single" w:color="CBD5E1" w:sz="4"/>
+              <w:bottom w:val="single" w:color="CBD5E1" w:sz="4"/>
+              <w:right w:val="single" w:color="CBD5E1" w:sz="4"/>
+            </w:tcBorders>
+            <w:tcMar>
+              <w:top w:type="dxa" w:w="80"/>
+              <w:left w:type="dxa" w:w="100"/>
+              <w:bottom w:type="dxa" w:w="80"/>
+              <w:right w:type="dxa" w:w="100"/>
+            </w:tcMar>
+          </w:tcPr>
+          <w:p>
+            <w:r>
+              <w:t xml:space="preserve">7 дней</w:t>
+            </w:r>
+          </w:p>
+        </w:tc>
+        <w:tc>
+          <w:tcPr>
+            <w:tcW w:type="dxa" w:w="2900"/>
+            <w:tcBorders>
+              <w:top w:val="single" w:color="CBD5E1" w:sz="4"/>
+              <w:left w:val="single" w:color="CBD5E1" w:sz="4"/>
+              <w:bottom w:val="single" w:color="CBD5E1" w:sz="4"/>
+              <w:right w:val="single" w:color="CBD5E1" w:sz="4"/>
+            </w:tcBorders>
+            <w:tcMar>
+              <w:top w:type="dxa" w:w="80"/>
+              <w:left w:type="dxa" w:w="100"/>
+              <w:bottom w:type="dxa" w:w="80"/>
+              <w:right w:type="dxa" w:w="100"/>
+            </w:tcMar>
+          </w:tcPr>
+          <w:p>
+            <w:r>
+              <w:t xml:space="preserve">04.09–10.09.2026</w:t>
+            </w:r>
+          </w:p>
+        </w:tc>
+        <w:tc>
+          <w:tcPr>
+            <w:tcW w:type="dxa" w:w="3900"/>
+            <w:tcBorders>
+              <w:top w:val="single" w:color="CBD5E1" w:sz="4"/>
+              <w:left w:val="single" w:color="CBD5E1" w:sz="4"/>
+              <w:bottom w:val="single" w:color="CBD5E1" w:sz="4"/>
+              <w:right w:val="single" w:color="CBD5E1" w:sz="4"/>
+            </w:tcBorders>
+            <w:tcMar>
+              <w:top w:type="dxa" w:w="80"/>
+              <w:left w:type="dxa" w:w="100"/>
+              <w:bottom w:type="dxa" w:w="80"/>
+              <w:right w:type="dxa" w:w="100"/>
+            </w:tcMar>
+          </w:tcPr>
+          <w:p>
+            <w:r>
+              <w:t xml:space="preserve">Не начат — сдвигается вместе с предыдущими этапами</w:t>
+            </w:r>
+          </w:p>
+        </w:tc>
+      </w:tr>
+    </w:tbl>
+    <w:p>
+      <w:pPr>
+        <w:spacing w:after="120"/>
+      </w:pPr>
+      <w:r>
+        <w:rPr>
+          <w:i/>
+          <w:iCs/>
+        </w:rPr>
+        <w:t xml:space="preserve">Пока доступ к КХД/ESB не получен, все даты в этой таблице — целевые ориентиры, а не подтверждённый план: весь календарь сдвигается день в день с задержкой получения доступа.</w:t>
       </w:r>
     </w:p>
     <w:p>
@@ -7005,7 +7546,7 @@
         </w:numPr>
         <w:spacing w:after="120"/>
       </w:pPr>
-      <w:hyperlink w:history="1" r:id="rIdqo40fi_dywvpw0agpibsu">
+      <w:hyperlink w:history="1" r:id="rId-skkslnuyarxktfeipate">
         <w:r>
           <w:rPr>
             <w:rStyle w:val="Hyperlink"/>
@@ -7027,7 +7568,7 @@
         </w:numPr>
         <w:spacing w:after="120"/>
       </w:pPr>
-      <w:hyperlink w:history="1" r:id="rIdlonewooqm_z4pdplmzmvl">
+      <w:hyperlink w:history="1" r:id="rIdacsefflaekcdrqjrrnn4w">
         <w:r>
           <w:rPr>
             <w:rStyle w:val="Hyperlink"/>
@@ -7049,7 +7590,7 @@
         </w:numPr>
         <w:spacing w:after="120"/>
       </w:pPr>
-      <w:hyperlink w:history="1" r:id="rIdqrx7udrfnh5d6zjqjk-wg">
+      <w:hyperlink w:history="1" r:id="rIdeyxw077mrg6iontutvzkc">
         <w:r>
           <w:rPr>
             <w:rStyle w:val="Hyperlink"/>
@@ -7061,7 +7602,7 @@
       <w:r>
         <w:t xml:space="preserve">, </w:t>
       </w:r>
-      <w:hyperlink w:history="1" r:id="rIdyov-1jicjmtqd-st9yomt">
+      <w:hyperlink w:history="1" r:id="rIdhyshrvoj4jrjc6obllxqa">
         <w:r>
           <w:rPr>
             <w:rStyle w:val="Hyperlink"/>

</xml_diff>

<commit_message>
Update КХД/ESB access status to in-progress, note test loading/scenario checks
Д8 has started provisioning access to the ESB bus and КХД and is working
through user connection setup - moves the checklist and Этап 1 status
from "not received/unknown" to "in progress" throughout (section 0,
checklist items 3-4, Этап 1 table, risk section). Also notes the
contractor-side parallel work: test document loading into RAG collections
is now explicitly checked against a test scenario, not just "loading".
</commit_message>
<xml_diff>
--- a/docs/analysis/case-03-pilot-execution-plan.docx
+++ b/docs/analysis/case-03-pilot-execution-plan.docx
@@ -72,7 +72,7 @@
           <w:b/>
           <w:bCs/>
         </w:rPr>
-        <w:t xml:space="preserve">Статус на сейчас (на 04.08.2026)</w:t>
+        <w:t xml:space="preserve">Статус на сейчас (на 05.08.2026)</w:t>
       </w:r>
       <w:r>
         <w:t xml:space="preserve">: номинальное начало работ — </w:t>
@@ -95,18 +95,17 @@
         <w:t xml:space="preserve">31.07.2026</w:t>
       </w:r>
       <w:r>
-        <w:t xml:space="preserve">, но по факту доступ </w:t>
+        <w:t xml:space="preserve">. Доступ пока не закрыт полностью, но сдвинулся с мёртвой точки: </w:t>
       </w:r>
       <w:r>
         <w:rPr>
           <w:b/>
           <w:bCs/>
-          <w:color w:val="B45309"/>
         </w:rPr>
-        <w:t xml:space="preserve">до сих пор не предоставлен</w:t>
-      </w:r>
-      <w:r>
-        <w:t xml:space="preserve"> — просрочка уже 4 дня к целевой дате и 8 дней к номинальному старту. По условиям ТЗ часы пилота считаются именно от даты фактического доступа, поэтому </w:t>
+        <w:t xml:space="preserve">со стороны заказчика (Д8) идёт предоставление доступа к ESB-шине и КХД, реализуется подключение пользователей</w:t>
+      </w:r>
+      <w:r>
+        <w:t xml:space="preserve">. Просрочка к целевой дате — 5 дней (9 дней к номинальному старту). По условиям ТЗ часы пилота считаются именно от даты фактического доступа, поэтому </w:t>
       </w:r>
       <w:r>
         <w:rPr>
@@ -117,7 +116,17 @@
         <w:t xml:space="preserve">официальный День 1 ещё не наступил</w:t>
       </w:r>
       <w:r>
-        <w:t xml:space="preserve"> — как только доступ откроется, календарь ниже пересчитывается от новой фактической даты. 27.07–04.08 засчитываются как подготовительная работа, не блокированная доступом (провижининг серверов, обсуждение состава ролей), но не входят в 6-недельный счётчик пилота.</w:t>
+        <w:t xml:space="preserve"> — как только доступ полностью откроется, календарь ниже пересчитывается от новой фактической даты. Параллельно, не дожидаясь закрытия доступа, </w:t>
+      </w:r>
+      <w:r>
+        <w:rPr>
+          <w:b/>
+          <w:bCs/>
+        </w:rPr>
+        <w:t xml:space="preserve">со стороны исполнителя идёт тестовая загрузка документов и проверка по тестовому сценарию</w:t>
+      </w:r>
+      <w:r>
+        <w:t xml:space="preserve">. 27.07–05.08 засчитываются как подготовительная работа, не блокированная доступом, но не входят в 6-недельный счётчик пилота.</w:t>
       </w:r>
     </w:p>
     <w:p>
@@ -132,7 +141,7 @@
         <w:t xml:space="preserve">Причина съезда сроков</w:t>
       </w:r>
       <w:r>
-        <w:t xml:space="preserve">: единственная причина текущего отставания — доступ к КХД/ESB со стороны заказчика (Д8), который по плану должен был быть открыт к 31.07.2026, но по состоянию на 04.08.2026 так и не предоставлен. Все остальные подготовительные работы (инфраструктура, состав ролей, RAG-коллекции) выполнены в срок или с опережением графика — см. Этап 1 ниже. Это единственный блокер, от которого зависит сдвиг всего последующего календаря.</w:t>
+        <w:t xml:space="preserve">: единственная причина текущего отставания — доступ к КХД/ESB со стороны заказчика (Д8), который по плану должен был быть открыт к 31.07.2026. На 05.08.2026 доступ находится в процессе предоставления (не закрыт полностью), поэтому официальный старт часов пилота ещё не наступил. Все остальные подготовительные работы (инфраструктура, состав ролей, RAG-коллекции, тестовая загрузка документов) выполнены в срок или с опережением графика — см. Этап 1 ниже. Доступ к КХД/ESB остаётся единственным блокером, от которого зависит сдвиг всего последующего календаря.</w:t>
       </w:r>
     </w:p>
     <w:p>
@@ -277,7 +286,7 @@
                 <w:bCs/>
                 <w:color w:val="FFFFFF"/>
               </w:rPr>
-              <w:t xml:space="preserve">Факт на 04.08.2026</w:t>
+              <w:t xml:space="preserve">Факт на 05.08.2026</w:t>
             </w:r>
           </w:p>
         </w:tc>
@@ -373,7 +382,7 @@
                 <w:bCs/>
                 <w:color w:val="B45309"/>
               </w:rPr>
-              <w:t xml:space="preserve">⏳ В процессе, заблокирован — не закрыт из-за отсутствия доступа к КХД/ESB</w:t>
+              <w:t xml:space="preserve">🔄 В процессе — доступ к КХД/ESB предоставляется, подключение пользователей реализуется</w:t>
             </w:r>
           </w:p>
         </w:tc>
@@ -658,7 +667,7 @@
           <w:i/>
           <w:iCs/>
         </w:rPr>
-        <w:t xml:space="preserve">Пока доступ к КХД/ESB не получен, все даты в этой таблице — целевые ориентиры, а не подтверждённый план: весь календарь сдвигается день в день с задержкой получения доступа.</w:t>
+        <w:t xml:space="preserve">Пока доступ к КХД/ESB не закрыт полностью, все даты в этой таблице — целевые ориентиры, а не подтверждённый план: весь календарь сдвигается день в день с задержкой получения доступа.</w:t>
       </w:r>
     </w:p>
     <w:p>
@@ -1088,7 +1097,7 @@
                 <w:bCs/>
                 <w:color w:val="B45309"/>
               </w:rPr>
-              <w:t xml:space="preserve">⏳ Статус не известен (не получено) — цель была 31.07.2026, блокирует старт часов пилота</w:t>
+              <w:t xml:space="preserve">🔄 В процессе — Д8 предоставляет доступ, реализуется подключение пользователей; цель была 31.07.2026, блокирует старт часов пилота</w:t>
             </w:r>
           </w:p>
         </w:tc>
@@ -1184,7 +1193,7 @@
                 <w:bCs/>
                 <w:color w:val="B45309"/>
               </w:rPr>
-              <w:t xml:space="preserve">⏳ Статус не известен (нет доступа) — цель была 31.07.2026, блокирует старт часов пилота</w:t>
+              <w:t xml:space="preserve">🔄 В процессе — Д8 предоставляет доступ, реализуется подключение пользователей; цель была 31.07.2026, блокирует старт часов пилота</w:t>
             </w:r>
           </w:p>
         </w:tc>
@@ -1864,7 +1873,7 @@
         <w:spacing w:after="120" w:before="240"/>
       </w:pPr>
       <w:r>
-        <w:t xml:space="preserve">Этап 1 — Подготовка и развёртывание (31.07–06.08.2026, целевые даты) — В ПРОЦЕССЕ, ЗАБЛОКИРОВАН</w:t>
+        <w:t xml:space="preserve">Этап 1 — Подготовка и развёртывание (31.07–06.08.2026, целевые даты) — В ПРОЦЕССЕ</w:t>
       </w:r>
     </w:p>
     <w:tbl>
@@ -2042,7 +2051,7 @@
                 <w:bCs/>
                 <w:color w:val="B45309"/>
               </w:rPr>
-              <w:t xml:space="preserve">⏳ Не получено</w:t>
+              <w:t xml:space="preserve">🔄 В процессе — доступ предоставляется, реализуется подключение пользователей</w:t>
             </w:r>
           </w:p>
         </w:tc>
@@ -2116,7 +2125,7 @@
                 <w:bCs/>
                 <w:color w:val="B45309"/>
               </w:rPr>
-              <w:t xml:space="preserve">⏳ Нет доступа</w:t>
+              <w:t xml:space="preserve">🔄 В процессе — доступ предоставляется, реализуется подключение пользователей</w:t>
             </w:r>
           </w:p>
         </w:tc>
@@ -2362,7 +2371,7 @@
           </w:tcPr>
           <w:p>
             <w:r>
-              <w:t xml:space="preserve">Загрузка документов в RAG-коллекции</w:t>
+              <w:t xml:space="preserve">Тестовая загрузка документов в RAG-коллекции и проверка по тестовому сценарию</w:t>
             </w:r>
           </w:p>
         </w:tc>
@@ -2578,7 +2587,7 @@
         <w:t xml:space="preserve">Результат этапа получен частично</w:t>
       </w:r>
       <w:r>
-        <w:t xml:space="preserve">: вся инфраструктура (сервер под СУБД+платформу, контейнерная среда) подтверждена и развёрнута — по факту это один общий сервер (≈8 vCPU, 32 ГБ RAM, 100 ГБ SSD), а не два раздельных, как изначально предполагалось по ТЗ; Docker разворачивали собственными силами. Состав ролей и RAG-коллекций согласован, загрузка документов в RAG идёт, поиск по коллекциям уже работает, пробный запуск проведён. Единственное, что остаётся открытым для закрытия Этапа 1 — доступ к КХД/ESB: без него официальный отсчёт 6-недельного пилота не запущен.</w:t>
+        <w:t xml:space="preserve">: вся инфраструктура (сервер под СУБД+платформу, контейнерная среда) подтверждена и развёрнута — по факту это один общий сервер (≈8 vCPU, 32 ГБ RAM, 100 ГБ SSD), а не два раздельных, как изначально предполагалось по ТЗ; Docker разворачивали собственными силами. Состав ролей и RAG-коллекций согласован, тестовая загрузка документов в RAG идёт, поиск по коллекциям уже работает и проверяется по тестовому сценарию, пробный запуск проведён. Доступ к КХД/ESB больше не в статусе «не получено» — Д8 уже предоставляет доступ и реализует подключение пользователей, но процесс ещё не завершён: без полного закрытия доступа официальный отсчёт 6-недельного пилота не запущен.</w:t>
       </w:r>
     </w:p>
     <w:p>
@@ -7442,10 +7451,10 @@
           <w:b/>
           <w:bCs/>
         </w:rPr>
-        <w:t xml:space="preserve">Активный риск: доступ к КХД/ESB просрочен и продолжает сдвигаться. </w:t>
-      </w:r>
-      <w:r>
-        <w:t xml:space="preserve">Номинальное начало работ — 27.07.2026, целевая дата доступа — 31.07.2026; на 04.08.2026 доступ так и не предоставлен (просрочка растёт день за днём, уже 4+ дня к цели и 8+ к номинальному старту). Пока это не эскалировано в дни, но требует внимания: если доступ не откроется в ближайшие дни, стоит поднять вопрос с Д8 напрямую, а не ждать дальше — при повторении такой задержки на Этапе 2 (интеграция MCP/RAG-компании, тоже вне прямого контроля подрядчика) накопленный сдвиг может дотянуть Этап 4 до середины сентября вместо 04.09, что стоит проговорить с Д8 заранее, а не постфактум.</w:t>
+        <w:t xml:space="preserve">Риск на снижение: доступ к КХД/ESB просрочен, но провижининг сдвинулся с мёртвой точки. </w:t>
+      </w:r>
+      <w:r>
+        <w:t xml:space="preserve">Номинальное начало работ — 27.07.2026, целевая дата доступа — 31.07.2026; на 05.08.2026 доступ ещё не закрыт полностью, но Д8 уже предоставляет доступ к ESB-шине и КХД и реализует подключение пользователей (просрочка 5 дней к цели, 9 — к номинальному старту). Пока это не эскалировано, но стоит держать темп на контроле: если процесс подключения затянется ещё на несколько дней, стоит поднять вопрос с Д8 напрямую — при повторении такой задержки на Этапе 2 (интеграция MCP/RAG-компании, тоже вне прямого контроля подрядчика) накопленный сдвиг может дотянуть Этап 4 до середины сентября вместо 04.09, что стоит проговорить с Д8 заранее, а не постфактум.</w:t>
       </w:r>
     </w:p>
     <w:p>
@@ -7546,7 +7555,7 @@
         </w:numPr>
         <w:spacing w:after="120"/>
       </w:pPr>
-      <w:hyperlink w:history="1" r:id="rId-skkslnuyarxktfeipate">
+      <w:hyperlink w:history="1" r:id="rIdymyz4_3drtfv31ufruoyu">
         <w:r>
           <w:rPr>
             <w:rStyle w:val="Hyperlink"/>
@@ -7568,7 +7577,7 @@
         </w:numPr>
         <w:spacing w:after="120"/>
       </w:pPr>
-      <w:hyperlink w:history="1" r:id="rIdacsefflaekcdrqjrrnn4w">
+      <w:hyperlink w:history="1" r:id="rIdqzedub8mkbiocosku0ewo">
         <w:r>
           <w:rPr>
             <w:rStyle w:val="Hyperlink"/>
@@ -7590,7 +7599,7 @@
         </w:numPr>
         <w:spacing w:after="120"/>
       </w:pPr>
-      <w:hyperlink w:history="1" r:id="rIdeyxw077mrg6iontutvzkc">
+      <w:hyperlink w:history="1" r:id="rId0ustuzwqjnbydbdszwe2-">
         <w:r>
           <w:rPr>
             <w:rStyle w:val="Hyperlink"/>
@@ -7602,7 +7611,7 @@
       <w:r>
         <w:t xml:space="preserve">, </w:t>
       </w:r>
-      <w:hyperlink w:history="1" r:id="rIdhyshrvoj4jrjc6obllxqa">
+      <w:hyperlink w:history="1" r:id="rIdwdmhuwwhea0rtk8y5aqzp">
         <w:r>
           <w:rPr>
             <w:rStyle w:val="Hyperlink"/>

</xml_diff>